<commit_message>
docs: bitácora y IPI del fix de proveedores + aislamiento por tenant
Registra en documentacion.md el hallazgo y la corrección de esta sesión
(dropdown de Materiales + las dos vías de alta de Supplier sin filtrar por
tenant). Actualiza el IPI: nota fechada en RNF-01 (Seguridad) y los cuatro
conteos de la suite de backend (521 → 526). Regenerado IPI-CONSTRUCTA.docx.

Co-Authored-By: Claude Sonnet 5 <noreply@anthropic.com>
</commit_message>
<xml_diff>
--- a/docs/ipi/IPI-CONSTRUCTA.docx
+++ b/docs/ipi/IPI-CONSTRUCTA.docx
@@ -3669,7 +3669,7 @@
           <w:color w:val="1A2329"/>
           <w:sz w:val="22"/>
         </w:rPr>
-        <w:t>Como respaldo transversal a varios de estos objetivos, la suite automatizada del backend alcanza 521 tests distribuidos en 46 archivos (ejecutados en integración continua), que cubren aislamiento por tenant, autenticación, rate limiting e importaciones, sumados a 25 pruebas de frontend sobre la lógica de alertas; no existen todavía pruebas de extremo a extremo (véase Pruebas).</w:t>
+        <w:t>Como respaldo transversal a varios de estos objetivos, la suite automatizada del backend alcanza 526 tests distribuidos en 46 archivos (ejecutados en integración continua), que cubren aislamiento por tenant, autenticación, rate limiting e importaciones, sumados a 25 pruebas de frontend sobre la lógica de alertas; no existen todavía pruebas de extremo a extremo (véase Pruebas).</w:t>
       </w:r>
     </w:p>
     <w:p>
@@ -10696,7 +10696,47 @@
           <w:color w:val="1A2329"/>
           <w:sz w:val="22"/>
         </w:rPr>
-        <w:t>; los recursos sensibles usan URLs firmadas. La auditoría del 13/08/2026 había identificado dos rutas sin filtro de tenant (presencia y simulación de vencidos administrativa); ambas quedaron corregidas en la remediación de las auditorías 06 y 11 (26/08/2026).</w:t>
+        <w:t>; los recursos sensibles usan URLs firmadas. La auditoría del 13/08/2026 había identificado dos rutas sin filtro de tenant (presencia y simulación de vencidos administrativa); ambas quedaron corregidas en la remediación de las auditorías 06 y 11 (26/08/2026). Una verificación manual del 08/09/2026, al probar en el navegador un ajuste no relacionado del módulo de Compras, encontró un tercer punto sin filtrar: el listado, edición y borrado de proveedores (</w:t>
+      </w:r>
+      <w:r>
+        <w:rPr>
+          <w:rFonts w:ascii="Consolas" w:hAnsi="Consolas"/>
+          <w:b w:val="0"/>
+          <w:i w:val="0"/>
+          <w:color w:val="1A2329"/>
+          <w:sz w:val="21"/>
+        </w:rPr>
+        <w:t>/suppliers</w:t>
+      </w:r>
+      <w:r>
+        <w:rPr>
+          <w:rFonts w:ascii="Calibri" w:hAnsi="Calibri"/>
+          <w:b w:val="0"/>
+          <w:i w:val="0"/>
+          <w:color w:val="1A2329"/>
+          <w:sz w:val="22"/>
+        </w:rPr>
+        <w:t xml:space="preserve">) devolvía y permitía modificar registros de cualquier empresa, y la alta automática de proveedor al confirmar un contratista directo tampoco fijaba el tenant. Corregido el mismo día, con 4 pruebas de regresión nuevas en </w:t>
+      </w:r>
+      <w:r>
+        <w:rPr>
+          <w:rFonts w:ascii="Consolas" w:hAnsi="Consolas"/>
+          <w:b w:val="0"/>
+          <w:i w:val="0"/>
+          <w:color w:val="1A2329"/>
+          <w:sz w:val="21"/>
+        </w:rPr>
+        <w:t>test_tenant_isolation.py</w:t>
+      </w:r>
+      <w:r>
+        <w:rPr>
+          <w:rFonts w:ascii="Calibri" w:hAnsi="Calibri"/>
+          <w:b w:val="0"/>
+          <w:i w:val="0"/>
+          <w:color w:val="1A2329"/>
+          <w:sz w:val="22"/>
+        </w:rPr>
+        <w:t>.</w:t>
       </w:r>
     </w:p>
     <w:p>
@@ -15330,7 +15370,7 @@
           <w:color w:val="1A2329"/>
           <w:sz w:val="22"/>
         </w:rPr>
-        <w:t>), cuya remediación se completó entre el 21 y el 28 de agosto de 2026. La suite automatizada creció a 521 tests distribuidos en 46 archivos, ejecutados en integración continua ante cada cambio: aislamiento por tenant (</w:t>
+        <w:t>), cuya remediación se completó entre el 21 y el 28 de agosto de 2026. La suite automatizada creció a 526 tests distribuidos en 46 archivos, ejecutados en integración continua ante cada cambio: aislamiento por tenant (</w:t>
       </w:r>
       <w:r>
         <w:rPr>
@@ -15350,7 +15390,7 @@
           <w:color w:val="1A2329"/>
           <w:sz w:val="22"/>
         </w:rPr>
-        <w:t xml:space="preserve">, que verifica que un usuario de una empresa no accede a los recursos de otra), permisos por obra, autenticación, </w:t>
+        <w:t xml:space="preserve">, que verifica que un usuario de una empresa no accede a los recursos de otra —incluida la fuga de proveedores cross-tenant detectada y corregida el 08/09/2026—), permisos por obra, autenticación, </w:t>
       </w:r>
       <w:r>
         <w:rPr>
@@ -16461,7 +16501,7 @@
           <w:color w:val="3E4A52"/>
           <w:sz w:val="21"/>
         </w:rPr>
-        <w:t xml:space="preserve"> El backend cuenta con 521 tests automatizados (</w:t>
+        <w:t xml:space="preserve"> El backend cuenta con 526 tests automatizados (</w:t>
       </w:r>
       <w:r>
         <w:rPr>
@@ -17825,7 +17865,7 @@
           <w:color w:val="1A2329"/>
           <w:sz w:val="22"/>
         </w:rPr>
-        <w:t xml:space="preserve">Quedan pendientes dos tipos de aspectos, de naturaleza distinta. Por un lado, dos funcionalidades declaradas explícitamente fuera de alcance del proyecto: la notificación automática al jefe o administrador de obra cuando un responsable responde a un recordatorio (funcionalidad analizada y diseñada, no implementada) y la pasarela de pago para el cobro efectivo de los planes de suscripción. Por otro lado, una brecha real detectada durante el desarrollo, hoy parcialmente cerrada: la suite automatizada cubre el backend (521 tests con </w:t>
+        <w:t xml:space="preserve">Quedan pendientes dos tipos de aspectos, de naturaleza distinta. Por un lado, dos funcionalidades declaradas explícitamente fuera de alcance del proyecto: la notificación automática al jefe o administrador de obra cuando un responsable responde a un recordatorio (funcionalidad analizada y diseñada, no implementada) y la pasarela de pago para el cobro efectivo de los planes de suscripción. Por otro lado, una brecha real detectada durante el desarrollo, hoy parcialmente cerrada: la suite automatizada cubre el backend (526 tests con </w:t>
       </w:r>
       <w:r>
         <w:rPr>

</xml_diff>

<commit_message>
docs: bitácora y actualización del IPI del Dashboard Avanzado (P0-P2)
Registra en docs/documentacion.md las tres etapas de implementación de los
13 indicadores del dashboard de obra, y refleja el trabajo en el IPI:
RF-77 a RF-82 nuevos (Dashboard de Indicadores), fila de trazabilidad del
objetivo 8 actualizada a "Implementado", módulo nuevo en Implementación,
casos de prueba y conteos de la suite actualizados en Pruebas, y un
beneficio nuevo en Beneficios post-implementación. .docx regenerado.

Co-Authored-By: Claude Sonnet 5 <noreply@anthropic.com>
</commit_message>
<xml_diff>
--- a/docs/ipi/IPI-CONSTRUCTA.docx
+++ b/docs/ipi/IPI-CONSTRUCTA.docx
@@ -3089,7 +3089,7 @@
                 <w:color w:val="1A2329"/>
                 <w:sz w:val="20"/>
               </w:rPr>
-              <w:t>Implementado, alcance acotado</w:t>
+              <w:t>Implementado</w:t>
             </w:r>
           </w:p>
         </w:tc>
@@ -3108,7 +3108,27 @@
                 <w:color w:val="1A2329"/>
                 <w:sz w:val="20"/>
               </w:rPr>
-              <w:t>Panel de obras con indicadores numéricos (total, en progreso, planificadas, completadas) y vista resumen por obra.</w:t>
+              <w:t xml:space="preserve">Panel de obra con trece indicadores servidos en una sola llamada: avance real ponderado por duración, avance planificado, índice de desempeño del cronograma (SPI), fecha de fin proyectada, salud de la ruta crítica, desvío contra la línea base, estado de hitos, ejecución de materiales, alertas por severidad, cuello de botella, y una curva de evolución planificado/real historizada día a día por un job del planificador. Cada bloque declara si el dato está disponible y por qué no lo está, en vez de completar con ceros. Diseño documentado en </w:t>
+            </w:r>
+            <w:r>
+              <w:rPr>
+                <w:rFonts w:ascii="Consolas" w:hAnsi="Consolas"/>
+                <w:b w:val="0"/>
+                <w:i w:val="0"/>
+                <w:color w:val="1A2329"/>
+                <w:sz w:val="19"/>
+              </w:rPr>
+              <w:t>docs/features/dashboard-indicadores-obra.md</w:t>
+            </w:r>
+            <w:r>
+              <w:rPr>
+                <w:rFonts w:ascii="Calibri" w:hAnsi="Calibri"/>
+                <w:b w:val="0"/>
+                <w:i w:val="0"/>
+                <w:color w:val="1A2329"/>
+                <w:sz w:val="20"/>
+              </w:rPr>
+              <w:t xml:space="preserve"> (09/09/2026) e implementación en tres etapas incrementales cerrada el 10/09/2026.</w:t>
             </w:r>
           </w:p>
         </w:tc>
@@ -3127,7 +3147,7 @@
                 <w:color w:val="1A2329"/>
                 <w:sz w:val="20"/>
               </w:rPr>
-              <w:t>Los indicadores son principalmente numéricos; podrían ampliarse a gráficos de evolución en el tiempo.</w:t>
+              <w:t>El toggle semana/mes de la curva de avance quedó acotado a semanal; el detalle por responsable de la concentración de retrasos se restringe a administradores por diseño, no por limitación técnica.</w:t>
             </w:r>
           </w:p>
         </w:tc>
@@ -3669,7 +3689,7 @@
           <w:color w:val="1A2329"/>
           <w:sz w:val="22"/>
         </w:rPr>
-        <w:t>Como respaldo transversal a varios de estos objetivos, la suite automatizada del backend alcanza 559 tests distribuidos en 49 archivos (ejecutados en integración continua), que cubren aislamiento por tenant, autenticación, rate limiting e importaciones, sumados a 25 pruebas de frontend sobre la lógica de alertas; no existen todavía pruebas de extremo a extremo (véase Pruebas).</w:t>
+        <w:t>Como respaldo transversal a varios de estos objetivos, la suite automatizada del backend alcanza 603 tests distribuidos en 54 archivos (ejecutados en integración continua), que cubren aislamiento por tenant, autenticación, rate limiting e importaciones, sumados a 49 pruebas de frontend sobre la lógica de alertas; no existen todavía pruebas de extremo a extremo (véase Pruebas).</w:t>
       </w:r>
     </w:p>
     <w:p>
@@ -10639,6 +10659,184 @@
     </w:p>
     <w:p>
       <w:pPr>
+        <w:spacing w:after="160" w:lineRule="auto" w:line="276"/>
+        <w:jc w:val="both"/>
+      </w:pPr>
+      <w:r>
+        <w:rPr>
+          <w:rFonts w:ascii="Calibri" w:hAnsi="Calibri"/>
+          <w:b/>
+          <w:i w:val="0"/>
+          <w:color w:val="1A2329"/>
+          <w:sz w:val="22"/>
+        </w:rPr>
+        <w:t>Dashboard de Indicadores</w:t>
+      </w:r>
+    </w:p>
+    <w:p>
+      <w:pPr>
+        <w:pStyle w:val="ListBullet"/>
+        <w:spacing w:after="60"/>
+        <w:jc w:val="both"/>
+      </w:pPr>
+      <w:r>
+        <w:rPr>
+          <w:rFonts w:ascii="Calibri" w:hAnsi="Calibri"/>
+          <w:b/>
+          <w:i w:val="0"/>
+          <w:color w:val="1A2329"/>
+          <w:sz w:val="22"/>
+        </w:rPr>
+        <w:t>RF-77:</w:t>
+      </w:r>
+      <w:r>
+        <w:rPr>
+          <w:rFonts w:ascii="Calibri" w:hAnsi="Calibri"/>
+          <w:b w:val="0"/>
+          <w:i w:val="0"/>
+          <w:color w:val="1A2329"/>
+          <w:sz w:val="22"/>
+        </w:rPr>
+        <w:t xml:space="preserve"> El sistema debe calcular el avance real de una obra ponderado por la duración planificada de cada tarea (días laborables), de modo que una tarea de veinte días pese veinte veces más que una de un día.</w:t>
+      </w:r>
+    </w:p>
+    <w:p>
+      <w:pPr>
+        <w:pStyle w:val="ListBullet"/>
+        <w:spacing w:after="60"/>
+        <w:jc w:val="both"/>
+      </w:pPr>
+      <w:r>
+        <w:rPr>
+          <w:rFonts w:ascii="Calibri" w:hAnsi="Calibri"/>
+          <w:b/>
+          <w:i w:val="0"/>
+          <w:color w:val="1A2329"/>
+          <w:sz w:val="22"/>
+        </w:rPr>
+        <w:t>RF-78:</w:t>
+      </w:r>
+      <w:r>
+        <w:rPr>
+          <w:rFonts w:ascii="Calibri" w:hAnsi="Calibri"/>
+          <w:b w:val="0"/>
+          <w:i w:val="0"/>
+          <w:color w:val="1A2329"/>
+          <w:sz w:val="22"/>
+        </w:rPr>
+        <w:t xml:space="preserve"> El sistema debe calcular el avance planificado a la fecha, el índice de desempeño del cronograma (SPI) resultante de comparar ambos, y proyectar la fecha de fin de obra a partir del ritmo de avance vigente.</w:t>
+      </w:r>
+    </w:p>
+    <w:p>
+      <w:pPr>
+        <w:pStyle w:val="ListBullet"/>
+        <w:spacing w:after="60"/>
+        <w:jc w:val="both"/>
+      </w:pPr>
+      <w:r>
+        <w:rPr>
+          <w:rFonts w:ascii="Calibri" w:hAnsi="Calibri"/>
+          <w:b/>
+          <w:i w:val="0"/>
+          <w:color w:val="1A2329"/>
+          <w:sz w:val="22"/>
+        </w:rPr>
+        <w:t>RF-79:</w:t>
+      </w:r>
+      <w:r>
+        <w:rPr>
+          <w:rFonts w:ascii="Calibri" w:hAnsi="Calibri"/>
+          <w:b w:val="0"/>
+          <w:i w:val="0"/>
+          <w:color w:val="1A2329"/>
+          <w:sz w:val="22"/>
+        </w:rPr>
+        <w:t xml:space="preserve"> El sistema debe agregar en el panel de obra la salud de la ruta crítica (cantidad de tareas críticas, en riesgo y con holgura, y la cobertura del cálculo) y el desvío del cronograma actual respecto de la línea base guardada.</w:t>
+      </w:r>
+    </w:p>
+    <w:p>
+      <w:pPr>
+        <w:pStyle w:val="ListBullet"/>
+        <w:spacing w:after="60"/>
+        <w:jc w:val="both"/>
+      </w:pPr>
+      <w:r>
+        <w:rPr>
+          <w:rFonts w:ascii="Calibri" w:hAnsi="Calibri"/>
+          <w:b/>
+          <w:i w:val="0"/>
+          <w:color w:val="1A2329"/>
+          <w:sz w:val="22"/>
+        </w:rPr>
+        <w:t>RF-80:</w:t>
+      </w:r>
+      <w:r>
+        <w:rPr>
+          <w:rFonts w:ascii="Calibri" w:hAnsi="Calibri"/>
+          <w:b w:val="0"/>
+          <w:i w:val="0"/>
+          <w:color w:val="1A2329"/>
+          <w:sz w:val="22"/>
+        </w:rPr>
+        <w:t xml:space="preserve"> El sistema debe mostrar el estado de cada hito de la obra (cumplido, cumplido con demora, en riesgo o pendiente) en el panel.</w:t>
+      </w:r>
+    </w:p>
+    <w:p>
+      <w:pPr>
+        <w:pStyle w:val="ListBullet"/>
+        <w:spacing w:after="60"/>
+        <w:jc w:val="both"/>
+      </w:pPr>
+      <w:r>
+        <w:rPr>
+          <w:rFonts w:ascii="Calibri" w:hAnsi="Calibri"/>
+          <w:b/>
+          <w:i w:val="0"/>
+          <w:color w:val="1A2329"/>
+          <w:sz w:val="22"/>
+        </w:rPr>
+        <w:t>RF-81:</w:t>
+      </w:r>
+      <w:r>
+        <w:rPr>
+          <w:rFonts w:ascii="Calibri" w:hAnsi="Calibri"/>
+          <w:b w:val="0"/>
+          <w:i w:val="0"/>
+          <w:color w:val="1A2329"/>
+          <w:sz w:val="22"/>
+        </w:rPr>
+        <w:t xml:space="preserve"> El sistema debe mostrar la ejecución de materiales de la obra (porcentaje comprometido y recibido respecto del estimado) y su alineación con el avance real.</w:t>
+      </w:r>
+    </w:p>
+    <w:p>
+      <w:pPr>
+        <w:pStyle w:val="ListBullet"/>
+        <w:spacing w:after="60"/>
+        <w:jc w:val="both"/>
+      </w:pPr>
+      <w:r>
+        <w:rPr>
+          <w:rFonts w:ascii="Calibri" w:hAnsi="Calibri"/>
+          <w:b/>
+          <w:i w:val="0"/>
+          <w:color w:val="1A2329"/>
+          <w:sz w:val="22"/>
+        </w:rPr>
+        <w:t>RF-82:</w:t>
+      </w:r>
+      <w:r>
+        <w:rPr>
+          <w:rFonts w:ascii="Calibri" w:hAnsi="Calibri"/>
+          <w:b w:val="0"/>
+          <w:i w:val="0"/>
+          <w:color w:val="1A2329"/>
+          <w:sz w:val="22"/>
+        </w:rPr>
+        <w:t xml:space="preserve"> El sistema debe historizar diariamente el avance de cada obra activa y presentar su evolución planificada frente a la real en un gráfico temporal, además de exponer en el panel la concentración de retrasos por tarea y por responsable y la precisión histórica de estimación por disciplina, restringiendo el detalle por responsable a usuarios administradores.</w:t>
+      </w:r>
+    </w:p>
+    <w:p>
+      <w:pPr>
         <w:keepNext/>
         <w:spacing w:before="200" w:after="80"/>
       </w:pPr>
@@ -13536,7 +13734,7 @@
           <w:color w:val="1A2329"/>
           <w:sz w:val="22"/>
         </w:rPr>
-        <w:t xml:space="preserve">, con una rama de control de versiones (Git) por cada etapa del plan, integrada al tronco principal tras su verificación. Cada cambio en el modelo de datos se materializó en una migración versionada (setenta y una en total, </w:t>
+        <w:t xml:space="preserve">, con una rama de control de versiones (Git) por cada etapa del plan, integrada al tronco principal tras su verificación. Cada cambio en el modelo de datos se materializó en una migración versionada (setenta y cuatro en total, </w:t>
       </w:r>
       <w:r>
         <w:rPr>
@@ -13566,7 +13764,7 @@
           <w:color w:val="1A2329"/>
           <w:sz w:val="21"/>
         </w:rPr>
-        <w:t>0071</w:t>
+        <w:t>0074</w:t>
       </w:r>
       <w:r>
         <w:rPr>
@@ -15312,37 +15510,6 @@
     </w:p>
     <w:p>
       <w:pPr>
-        <w:keepNext/>
-        <w:spacing w:before="200" w:after="80"/>
-      </w:pPr>
-      <w:r>
-        <w:rPr>
-          <w:rFonts w:ascii="Calibri" w:hAnsi="Calibri"/>
-          <w:b/>
-          <w:color w:val="1A2329"/>
-          <w:sz w:val="26"/>
-        </w:rPr>
-        <w:t>Pruebas</w:t>
-      </w:r>
-    </w:p>
-    <w:p>
-      <w:pPr>
-        <w:spacing w:after="160" w:lineRule="auto" w:line="276"/>
-        <w:jc w:val="both"/>
-      </w:pPr>
-      <w:r>
-        <w:rPr>
-          <w:rFonts w:ascii="Calibri" w:hAnsi="Calibri"/>
-          <w:b w:val="0"/>
-          <w:i w:val="0"/>
-          <w:color w:val="1A2329"/>
-          <w:sz w:val="22"/>
-        </w:rPr>
-        <w:t>La estrategia de verificación combinó distintos niveles:</w:t>
-      </w:r>
-    </w:p>
-    <w:p>
-      <w:pPr>
         <w:pStyle w:val="ListBullet"/>
         <w:spacing w:after="60"/>
         <w:jc w:val="both"/>
@@ -15355,17 +15522,17 @@
           <w:color w:val="1A2329"/>
           <w:sz w:val="22"/>
         </w:rPr>
-        <w:t>Plan de pruebas:</w:t>
-      </w:r>
-      <w:r>
-        <w:rPr>
-          <w:rFonts w:ascii="Calibri" w:hAnsi="Calibri"/>
-          <w:b w:val="0"/>
-          <w:i w:val="0"/>
-          <w:color w:val="1A2329"/>
-          <w:sz w:val="22"/>
-        </w:rPr>
-        <w:t xml:space="preserve"> se mantiene un conjunto de casos de prueba manuales documentados en </w:t>
+        <w:t>Módulo de dashboard de indicadores:</w:t>
+      </w:r>
+      <w:r>
+        <w:rPr>
+          <w:rFonts w:ascii="Calibri" w:hAnsi="Calibri"/>
+          <w:b w:val="0"/>
+          <w:i w:val="0"/>
+          <w:color w:val="1A2329"/>
+          <w:sz w:val="22"/>
+        </w:rPr>
+        <w:t xml:space="preserve"> reemplaza el panel de obra original —que contaba tareas completadas sin ponderar su tamaño— por trece indicadores servidos en una sola llamada (</w:t>
       </w:r>
       <w:r>
         <w:rPr>
@@ -15375,17 +15542,268 @@
           <w:color w:val="1A2329"/>
           <w:sz w:val="21"/>
         </w:rPr>
-        <w:t>docs/referencia/casos_de_prueba.md</w:t>
-      </w:r>
-      <w:r>
-        <w:rPr>
-          <w:rFonts w:ascii="Calibri" w:hAnsi="Calibri"/>
-          <w:b w:val="0"/>
-          <w:i w:val="0"/>
-          <w:color w:val="1A2329"/>
-          <w:sz w:val="22"/>
-        </w:rPr>
-        <w:t>.</w:t>
+        <w:t>GET /obras/{id}/dashboard</w:t>
+      </w:r>
+      <w:r>
+        <w:rPr>
+          <w:rFonts w:ascii="Calibri" w:hAnsi="Calibri"/>
+          <w:b w:val="0"/>
+          <w:i w:val="0"/>
+          <w:color w:val="1A2329"/>
+          <w:sz w:val="22"/>
+        </w:rPr>
+        <w:t>), diseñados primero como documento (</w:t>
+      </w:r>
+      <w:r>
+        <w:rPr>
+          <w:rFonts w:ascii="Consolas" w:hAnsi="Consolas"/>
+          <w:b w:val="0"/>
+          <w:i w:val="0"/>
+          <w:color w:val="1A2329"/>
+          <w:sz w:val="21"/>
+        </w:rPr>
+        <w:t>docs/features/dashboard-indicadores-obra.md</w:t>
+      </w:r>
+      <w:r>
+        <w:rPr>
+          <w:rFonts w:ascii="Calibri" w:hAnsi="Calibri"/>
+          <w:b w:val="0"/>
+          <w:i w:val="0"/>
+          <w:color w:val="1A2329"/>
+          <w:sz w:val="22"/>
+        </w:rPr>
+        <w:t xml:space="preserve">) y luego implementados en tres etapas incrementales. El </w:t>
+      </w:r>
+      <w:r>
+        <w:rPr>
+          <w:rFonts w:ascii="Calibri" w:hAnsi="Calibri"/>
+          <w:b/>
+          <w:i w:val="0"/>
+          <w:color w:val="1A2329"/>
+          <w:sz w:val="22"/>
+        </w:rPr>
+        <w:t>avance real</w:t>
+      </w:r>
+      <w:r>
+        <w:rPr>
+          <w:rFonts w:ascii="Calibri" w:hAnsi="Calibri"/>
+          <w:b w:val="0"/>
+          <w:i w:val="0"/>
+          <w:color w:val="1A2329"/>
+          <w:sz w:val="22"/>
+        </w:rPr>
+        <w:t xml:space="preserve"> se pondera por la duración planificada de cada tarea en días laborables, y se compara contra el </w:t>
+      </w:r>
+      <w:r>
+        <w:rPr>
+          <w:rFonts w:ascii="Calibri" w:hAnsi="Calibri"/>
+          <w:b/>
+          <w:i w:val="0"/>
+          <w:color w:val="1A2329"/>
+          <w:sz w:val="22"/>
+        </w:rPr>
+        <w:t>avance planificado</w:t>
+      </w:r>
+      <w:r>
+        <w:rPr>
+          <w:rFonts w:ascii="Calibri" w:hAnsi="Calibri"/>
+          <w:b w:val="0"/>
+          <w:i w:val="0"/>
+          <w:color w:val="1A2329"/>
+          <w:sz w:val="22"/>
+        </w:rPr>
+        <w:t xml:space="preserve"> a la fecha para obtener el </w:t>
+      </w:r>
+      <w:r>
+        <w:rPr>
+          <w:rFonts w:ascii="Calibri" w:hAnsi="Calibri"/>
+          <w:b/>
+          <w:i w:val="0"/>
+          <w:color w:val="1A2329"/>
+          <w:sz w:val="22"/>
+        </w:rPr>
+        <w:t>índice de desempeño del cronograma (SPI)</w:t>
+      </w:r>
+      <w:r>
+        <w:rPr>
+          <w:rFonts w:ascii="Calibri" w:hAnsi="Calibri"/>
+          <w:b w:val="0"/>
+          <w:i w:val="0"/>
+          <w:color w:val="1A2329"/>
+          <w:sz w:val="22"/>
+        </w:rPr>
+        <w:t xml:space="preserve">, del que además se deriva una </w:t>
+      </w:r>
+      <w:r>
+        <w:rPr>
+          <w:rFonts w:ascii="Calibri" w:hAnsi="Calibri"/>
+          <w:b/>
+          <w:i w:val="0"/>
+          <w:color w:val="1A2329"/>
+          <w:sz w:val="22"/>
+        </w:rPr>
+        <w:t>fecha de fin proyectada</w:t>
+      </w:r>
+      <w:r>
+        <w:rPr>
+          <w:rFonts w:ascii="Calibri" w:hAnsi="Calibri"/>
+          <w:b w:val="0"/>
+          <w:i w:val="0"/>
+          <w:color w:val="1A2329"/>
+          <w:sz w:val="22"/>
+        </w:rPr>
+        <w:t xml:space="preserve">. Se agregan en el mismo panel la </w:t>
+      </w:r>
+      <w:r>
+        <w:rPr>
+          <w:rFonts w:ascii="Calibri" w:hAnsi="Calibri"/>
+          <w:b/>
+          <w:i w:val="0"/>
+          <w:color w:val="1A2329"/>
+          <w:sz w:val="22"/>
+        </w:rPr>
+        <w:t>salud de la ruta crítica</w:t>
+      </w:r>
+      <w:r>
+        <w:rPr>
+          <w:rFonts w:ascii="Calibri" w:hAnsi="Calibri"/>
+          <w:b w:val="0"/>
+          <w:i w:val="0"/>
+          <w:color w:val="1A2329"/>
+          <w:sz w:val="22"/>
+        </w:rPr>
+        <w:t xml:space="preserve"> (tareas críticas, en riesgo y holgura mediana, con su porcentaje de cobertura), el </w:t>
+      </w:r>
+      <w:r>
+        <w:rPr>
+          <w:rFonts w:ascii="Calibri" w:hAnsi="Calibri"/>
+          <w:b/>
+          <w:i w:val="0"/>
+          <w:color w:val="1A2329"/>
+          <w:sz w:val="22"/>
+        </w:rPr>
+        <w:t>desvío contra la línea base</w:t>
+      </w:r>
+      <w:r>
+        <w:rPr>
+          <w:rFonts w:ascii="Calibri" w:hAnsi="Calibri"/>
+          <w:b w:val="0"/>
+          <w:i w:val="0"/>
+          <w:color w:val="1A2329"/>
+          <w:sz w:val="22"/>
+        </w:rPr>
+        <w:t xml:space="preserve"> guardada, el </w:t>
+      </w:r>
+      <w:r>
+        <w:rPr>
+          <w:rFonts w:ascii="Calibri" w:hAnsi="Calibri"/>
+          <w:b/>
+          <w:i w:val="0"/>
+          <w:color w:val="1A2329"/>
+          <w:sz w:val="22"/>
+        </w:rPr>
+        <w:t>estado de cada hito</w:t>
+      </w:r>
+      <w:r>
+        <w:rPr>
+          <w:rFonts w:ascii="Calibri" w:hAnsi="Calibri"/>
+          <w:b w:val="0"/>
+          <w:i w:val="0"/>
+          <w:color w:val="1A2329"/>
+          <w:sz w:val="22"/>
+        </w:rPr>
+        <w:t xml:space="preserve"> (cumplido, cumplido con demora, en riesgo o pendiente) y la </w:t>
+      </w:r>
+      <w:r>
+        <w:rPr>
+          <w:rFonts w:ascii="Calibri" w:hAnsi="Calibri"/>
+          <w:b/>
+          <w:i w:val="0"/>
+          <w:color w:val="1A2329"/>
+          <w:sz w:val="22"/>
+        </w:rPr>
+        <w:t>ejecución de materiales</w:t>
+      </w:r>
+      <w:r>
+        <w:rPr>
+          <w:rFonts w:ascii="Calibri" w:hAnsi="Calibri"/>
+          <w:b w:val="0"/>
+          <w:i w:val="0"/>
+          <w:color w:val="1A2329"/>
+          <w:sz w:val="22"/>
+        </w:rPr>
+        <w:t xml:space="preserve"> frente al estimado, con un indicador de alineación entre lo recibido y el avance real. Cada bloque declara explícitamente si el dato está disponible y por qué no, en vez de mostrar un cero cuando no hay información suficiente —por ejemplo, sin línea base guardada el bloque correspondiente no se calcula, no se completa con ceros—. Para la </w:t>
+      </w:r>
+      <w:r>
+        <w:rPr>
+          <w:rFonts w:ascii="Calibri" w:hAnsi="Calibri"/>
+          <w:b/>
+          <w:i w:val="0"/>
+          <w:color w:val="1A2329"/>
+          <w:sz w:val="22"/>
+        </w:rPr>
+        <w:t>evolución histórica</w:t>
+      </w:r>
+      <w:r>
+        <w:rPr>
+          <w:rFonts w:ascii="Calibri" w:hAnsi="Calibri"/>
+          <w:b w:val="0"/>
+          <w:i w:val="0"/>
+          <w:color w:val="1A2329"/>
+          <w:sz w:val="22"/>
+        </w:rPr>
+        <w:t xml:space="preserve"> (curva de avance planificado vs. real en el tiempo) se agregó una tabla nueva (</w:t>
+      </w:r>
+      <w:r>
+        <w:rPr>
+          <w:rFonts w:ascii="Consolas" w:hAnsi="Consolas"/>
+          <w:b w:val="0"/>
+          <w:i w:val="0"/>
+          <w:color w:val="1A2329"/>
+          <w:sz w:val="21"/>
+        </w:rPr>
+        <w:t>obra_progress_daily</w:t>
+      </w:r>
+      <w:r>
+        <w:rPr>
+          <w:rFonts w:ascii="Calibri" w:hAnsi="Calibri"/>
+          <w:b w:val="0"/>
+          <w:i w:val="0"/>
+          <w:color w:val="1A2329"/>
+          <w:sz w:val="22"/>
+        </w:rPr>
+        <w:t>) que un job diario del planificador completa hacia adelante, sin reconstruir el pasado desde el historial de eventos por ser una operación frágil; el ajuste no fue trivial, porque el punto semanal del gráfico y la fila guardada por el job rara vez caen en la misma fecha exacta —se emparejan por cercanía, con una tolerancia de tres días—. Por último, un acordeón colapsado por defecto expone dos métricas que el sistema ya calculaba mensualmente pero que hasta ahora solo alimentaban un informe interno sin consumo desde la aplicación: la concentración de retrasos (regla 80/20, por tarea y por responsable) y la precisión histórica de estimación por disciplina; el detalle por responsable se filtra en el backend y solo se envía a usuarios administradores, para no convertir una herramienta de coordinación en una de evaluación de desempeño individual.</w:t>
+      </w:r>
+    </w:p>
+    <w:p>
+      <w:pPr>
+        <w:keepNext/>
+        <w:spacing w:before="200" w:after="80"/>
+      </w:pPr>
+      <w:r>
+        <w:rPr>
+          <w:rFonts w:ascii="Calibri" w:hAnsi="Calibri"/>
+          <w:b/>
+          <w:color w:val="1A2329"/>
+          <w:sz w:val="26"/>
+        </w:rPr>
+        <w:t>Pruebas</w:t>
+      </w:r>
+    </w:p>
+    <w:p>
+      <w:pPr>
+        <w:spacing w:after="160" w:lineRule="auto" w:line="276"/>
+        <w:jc w:val="both"/>
+      </w:pPr>
+      <w:r>
+        <w:rPr>
+          <w:rFonts w:ascii="Calibri" w:hAnsi="Calibri"/>
+          <w:b w:val="0"/>
+          <w:i w:val="0"/>
+          <w:color w:val="1A2329"/>
+          <w:sz w:val="22"/>
+        </w:rPr>
+        <w:t>La estrategia de verificación combinó distintos niveles:</w:t>
       </w:r>
     </w:p>
     <w:p>
@@ -15402,17 +15820,37 @@
           <w:color w:val="1A2329"/>
           <w:sz w:val="22"/>
         </w:rPr>
-        <w:t>Pruebas funcionales y de aceptación:</w:t>
-      </w:r>
-      <w:r>
-        <w:rPr>
-          <w:rFonts w:ascii="Calibri" w:hAnsi="Calibri"/>
-          <w:b w:val="0"/>
-          <w:i w:val="0"/>
-          <w:color w:val="1A2329"/>
-          <w:sz w:val="22"/>
-        </w:rPr>
-        <w:t xml:space="preserve"> cada módulo se verificó ejecutando la aplicación en el navegador contra el backend real, comprobando el comportamiento esperado de las interacciones (por ejemplo, el relleno por arrastre con encadenado de fechas persistiendo en la base, o el flujo completo de la bitácora por voz).</w:t>
+        <w:t>Plan de pruebas:</w:t>
+      </w:r>
+      <w:r>
+        <w:rPr>
+          <w:rFonts w:ascii="Calibri" w:hAnsi="Calibri"/>
+          <w:b w:val="0"/>
+          <w:i w:val="0"/>
+          <w:color w:val="1A2329"/>
+          <w:sz w:val="22"/>
+        </w:rPr>
+        <w:t xml:space="preserve"> se mantiene un conjunto de casos de prueba manuales documentados en </w:t>
+      </w:r>
+      <w:r>
+        <w:rPr>
+          <w:rFonts w:ascii="Consolas" w:hAnsi="Consolas"/>
+          <w:b w:val="0"/>
+          <w:i w:val="0"/>
+          <w:color w:val="1A2329"/>
+          <w:sz w:val="21"/>
+        </w:rPr>
+        <w:t>docs/referencia/casos_de_prueba.md</w:t>
+      </w:r>
+      <w:r>
+        <w:rPr>
+          <w:rFonts w:ascii="Calibri" w:hAnsi="Calibri"/>
+          <w:b w:val="0"/>
+          <w:i w:val="0"/>
+          <w:color w:val="1A2329"/>
+          <w:sz w:val="22"/>
+        </w:rPr>
+        <w:t>.</w:t>
       </w:r>
     </w:p>
     <w:p>
@@ -15429,17 +15867,17 @@
           <w:color w:val="1A2329"/>
           <w:sz w:val="22"/>
         </w:rPr>
-        <w:t>Pruebas de integración:</w:t>
-      </w:r>
-      <w:r>
-        <w:rPr>
-          <w:rFonts w:ascii="Calibri" w:hAnsi="Calibri"/>
-          <w:b w:val="0"/>
-          <w:i w:val="0"/>
-          <w:color w:val="1A2329"/>
-          <w:sz w:val="22"/>
-        </w:rPr>
-        <w:t xml:space="preserve"> se verificaron de extremo a extremo los flujos que atraviesan varias capas e integraciones, como el envío de una nota de voz por WhatsApp → transcripción → análisis con IA → registro en la bitácora, y la lectura y comparación de presupuestos con el modelo de lenguaje.</w:t>
+        <w:t>Pruebas funcionales y de aceptación:</w:t>
+      </w:r>
+      <w:r>
+        <w:rPr>
+          <w:rFonts w:ascii="Calibri" w:hAnsi="Calibri"/>
+          <w:b w:val="0"/>
+          <w:i w:val="0"/>
+          <w:color w:val="1A2329"/>
+          <w:sz w:val="22"/>
+        </w:rPr>
+        <w:t xml:space="preserve"> cada módulo se verificó ejecutando la aplicación en el navegador contra el backend real, comprobando el comportamiento esperado de las interacciones (por ejemplo, el relleno por arrastre con encadenado de fechas persistiendo en la base, o el flujo completo de la bitácora por voz).</w:t>
       </w:r>
     </w:p>
     <w:p>
@@ -15456,57 +15894,17 @@
           <w:color w:val="1A2329"/>
           <w:sz w:val="22"/>
         </w:rPr>
-        <w:t>Verificación de regresiones:</w:t>
-      </w:r>
-      <w:r>
-        <w:rPr>
-          <w:rFonts w:ascii="Calibri" w:hAnsi="Calibri"/>
-          <w:b w:val="0"/>
-          <w:i w:val="0"/>
-          <w:color w:val="1A2329"/>
-          <w:sz w:val="22"/>
-        </w:rPr>
-        <w:t xml:space="preserve"> ante cada cambio se ejecutó la verificación de tipos (</w:t>
-      </w:r>
-      <w:r>
-        <w:rPr>
-          <w:rFonts w:ascii="Consolas" w:hAnsi="Consolas"/>
-          <w:b w:val="0"/>
-          <w:i w:val="0"/>
-          <w:color w:val="1A2329"/>
-          <w:sz w:val="21"/>
-        </w:rPr>
-        <w:t>tsc</w:t>
-      </w:r>
-      <w:r>
-        <w:rPr>
-          <w:rFonts w:ascii="Calibri" w:hAnsi="Calibri"/>
-          <w:b w:val="0"/>
-          <w:i w:val="0"/>
-          <w:color w:val="1A2329"/>
-          <w:sz w:val="22"/>
-        </w:rPr>
-        <w:t xml:space="preserve">) y la compilación de producción del frontend, y se realizó una auditoría general de la aplicación documentada en </w:t>
-      </w:r>
-      <w:r>
-        <w:rPr>
-          <w:rFonts w:ascii="Consolas" w:hAnsi="Consolas"/>
-          <w:b w:val="0"/>
-          <w:i w:val="0"/>
-          <w:color w:val="1A2329"/>
-          <w:sz w:val="21"/>
-        </w:rPr>
-        <w:t>docs/auditoria/auditoria-general.md</w:t>
-      </w:r>
-      <w:r>
-        <w:rPr>
-          <w:rFonts w:ascii="Calibri" w:hAnsi="Calibri"/>
-          <w:b w:val="0"/>
-          <w:i w:val="0"/>
-          <w:color w:val="1A2329"/>
-          <w:sz w:val="22"/>
-        </w:rPr>
-        <w:t>.</w:t>
+        <w:t>Pruebas de integración:</w:t>
+      </w:r>
+      <w:r>
+        <w:rPr>
+          <w:rFonts w:ascii="Calibri" w:hAnsi="Calibri"/>
+          <w:b w:val="0"/>
+          <w:i w:val="0"/>
+          <w:color w:val="1A2329"/>
+          <w:sz w:val="22"/>
+        </w:rPr>
+        <w:t xml:space="preserve"> se verificaron de extremo a extremo los flujos que atraviesan varias capas e integraciones, como el envío de una nota de voz por WhatsApp → transcripción → análisis con IA → registro en la bitácora, y la lectura y comparación de presupuestos con el modelo de lenguaje.</w:t>
       </w:r>
     </w:p>
     <w:p>
@@ -15523,6 +15921,73 @@
           <w:color w:val="1A2329"/>
           <w:sz w:val="22"/>
         </w:rPr>
+        <w:t>Verificación de regresiones:</w:t>
+      </w:r>
+      <w:r>
+        <w:rPr>
+          <w:rFonts w:ascii="Calibri" w:hAnsi="Calibri"/>
+          <w:b w:val="0"/>
+          <w:i w:val="0"/>
+          <w:color w:val="1A2329"/>
+          <w:sz w:val="22"/>
+        </w:rPr>
+        <w:t xml:space="preserve"> ante cada cambio se ejecutó la verificación de tipos (</w:t>
+      </w:r>
+      <w:r>
+        <w:rPr>
+          <w:rFonts w:ascii="Consolas" w:hAnsi="Consolas"/>
+          <w:b w:val="0"/>
+          <w:i w:val="0"/>
+          <w:color w:val="1A2329"/>
+          <w:sz w:val="21"/>
+        </w:rPr>
+        <w:t>tsc</w:t>
+      </w:r>
+      <w:r>
+        <w:rPr>
+          <w:rFonts w:ascii="Calibri" w:hAnsi="Calibri"/>
+          <w:b w:val="0"/>
+          <w:i w:val="0"/>
+          <w:color w:val="1A2329"/>
+          <w:sz w:val="22"/>
+        </w:rPr>
+        <w:t xml:space="preserve">) y la compilación de producción del frontend, y se realizó una auditoría general de la aplicación documentada en </w:t>
+      </w:r>
+      <w:r>
+        <w:rPr>
+          <w:rFonts w:ascii="Consolas" w:hAnsi="Consolas"/>
+          <w:b w:val="0"/>
+          <w:i w:val="0"/>
+          <w:color w:val="1A2329"/>
+          <w:sz w:val="21"/>
+        </w:rPr>
+        <w:t>docs/auditoria/auditoria-general.md</w:t>
+      </w:r>
+      <w:r>
+        <w:rPr>
+          <w:rFonts w:ascii="Calibri" w:hAnsi="Calibri"/>
+          <w:b w:val="0"/>
+          <w:i w:val="0"/>
+          <w:color w:val="1A2329"/>
+          <w:sz w:val="22"/>
+        </w:rPr>
+        <w:t>.</w:t>
+      </w:r>
+    </w:p>
+    <w:p>
+      <w:pPr>
+        <w:pStyle w:val="ListBullet"/>
+        <w:spacing w:after="60"/>
+        <w:jc w:val="both"/>
+      </w:pPr>
+      <w:r>
+        <w:rPr>
+          <w:rFonts w:ascii="Calibri" w:hAnsi="Calibri"/>
+          <w:b/>
+          <w:i w:val="0"/>
+          <w:color w:val="1A2329"/>
+          <w:sz w:val="22"/>
+        </w:rPr>
         <w:t>Auditoría técnica sistemática:</w:t>
       </w:r>
       <w:r>
@@ -15633,7 +16098,7 @@
           <w:color w:val="1A2329"/>
           <w:sz w:val="22"/>
         </w:rPr>
-        <w:t>), cuya remediación se completó entre el 21 y el 28 de agosto de 2026. La suite automatizada creció a 559 tests distribuidos en 49 archivos, ejecutados en integración continua ante cada cambio: aislamiento por tenant (</w:t>
+        <w:t>), cuya remediación se completó entre el 21 y el 28 de agosto de 2026. La suite automatizada creció a 603 tests distribuidos en 54 archivos, ejecutados en integración continua ante cada cambio: aislamiento por tenant (</w:t>
       </w:r>
       <w:r>
         <w:rPr>
@@ -15673,7 +16138,107 @@
           <w:color w:val="1A2329"/>
           <w:sz w:val="22"/>
         </w:rPr>
-        <w:t xml:space="preserve">, importaciones, robustez de infraestructura y un archivo por módulo auditado. A esa suite se sumaron 49 pruebas de frontend con </w:t>
+        <w:t>, importaciones, robustez de infraestructura y un archivo por módulo auditado, entre ellos los cinco del dashboard de indicadores (</w:t>
+      </w:r>
+      <w:r>
+        <w:rPr>
+          <w:rFonts w:ascii="Consolas" w:hAnsi="Consolas"/>
+          <w:b w:val="0"/>
+          <w:i w:val="0"/>
+          <w:color w:val="1A2329"/>
+          <w:sz w:val="21"/>
+        </w:rPr>
+        <w:t>test_dashboard_calc.py</w:t>
+      </w:r>
+      <w:r>
+        <w:rPr>
+          <w:rFonts w:ascii="Calibri" w:hAnsi="Calibri"/>
+          <w:b w:val="0"/>
+          <w:i w:val="0"/>
+          <w:color w:val="1A2329"/>
+          <w:sz w:val="22"/>
+        </w:rPr>
+        <w:t xml:space="preserve">, </w:t>
+      </w:r>
+      <w:r>
+        <w:rPr>
+          <w:rFonts w:ascii="Consolas" w:hAnsi="Consolas"/>
+          <w:b w:val="0"/>
+          <w:i w:val="0"/>
+          <w:color w:val="1A2329"/>
+          <w:sz w:val="21"/>
+        </w:rPr>
+        <w:t>test_obra_dashboard.py</w:t>
+      </w:r>
+      <w:r>
+        <w:rPr>
+          <w:rFonts w:ascii="Calibri" w:hAnsi="Calibri"/>
+          <w:b w:val="0"/>
+          <w:i w:val="0"/>
+          <w:color w:val="1A2329"/>
+          <w:sz w:val="22"/>
+        </w:rPr>
+        <w:t xml:space="preserve">, </w:t>
+      </w:r>
+      <w:r>
+        <w:rPr>
+          <w:rFonts w:ascii="Consolas" w:hAnsi="Consolas"/>
+          <w:b w:val="0"/>
+          <w:i w:val="0"/>
+          <w:color w:val="1A2329"/>
+          <w:sz w:val="21"/>
+        </w:rPr>
+        <w:t>test_obra_progress_daily.py</w:t>
+      </w:r>
+      <w:r>
+        <w:rPr>
+          <w:rFonts w:ascii="Calibri" w:hAnsi="Calibri"/>
+          <w:b w:val="0"/>
+          <w:i w:val="0"/>
+          <w:color w:val="1A2329"/>
+          <w:sz w:val="22"/>
+        </w:rPr>
+        <w:t xml:space="preserve">, </w:t>
+      </w:r>
+      <w:r>
+        <w:rPr>
+          <w:rFonts w:ascii="Consolas" w:hAnsi="Consolas"/>
+          <w:b w:val="0"/>
+          <w:i w:val="0"/>
+          <w:color w:val="1A2329"/>
+          <w:sz w:val="21"/>
+        </w:rPr>
+        <w:t>test_curva_s.py</w:t>
+      </w:r>
+      <w:r>
+        <w:rPr>
+          <w:rFonts w:ascii="Calibri" w:hAnsi="Calibri"/>
+          <w:b w:val="0"/>
+          <w:i w:val="0"/>
+          <w:color w:val="1A2329"/>
+          <w:sz w:val="22"/>
+        </w:rPr>
+        <w:t xml:space="preserve">, </w:t>
+      </w:r>
+      <w:r>
+        <w:rPr>
+          <w:rFonts w:ascii="Consolas" w:hAnsi="Consolas"/>
+          <w:b w:val="0"/>
+          <w:i w:val="0"/>
+          <w:color w:val="1A2329"/>
+          <w:sz w:val="21"/>
+        </w:rPr>
+        <w:t>test_monthly_insights.py</w:t>
+      </w:r>
+      <w:r>
+        <w:rPr>
+          <w:rFonts w:ascii="Calibri" w:hAnsi="Calibri"/>
+          <w:b w:val="0"/>
+          <w:i w:val="0"/>
+          <w:color w:val="1A2329"/>
+          <w:sz w:val="22"/>
+        </w:rPr>
+        <w:t xml:space="preserve">). A esa suite se sumaron 49 pruebas de frontend con </w:t>
       </w:r>
       <w:r>
         <w:rPr>
@@ -16731,6 +17296,236 @@
           </w:p>
         </w:tc>
       </w:tr>
+      <w:tr>
+        <w:tc>
+          <w:tcPr>
+            <w:tcW w:type="dxa" w:w="3120"/>
+            <w:shd w:val="clear" w:fill="F6F7F6"/>
+          </w:tcPr>
+          <w:p>
+            <w:r/>
+            <w:r>
+              <w:rPr>
+                <w:rFonts w:ascii="Calibri" w:hAnsi="Calibri"/>
+                <w:b w:val="0"/>
+                <w:i w:val="0"/>
+                <w:color w:val="1A2329"/>
+                <w:sz w:val="20"/>
+              </w:rPr>
+              <w:t>Avance ponderado sin línea base</w:t>
+            </w:r>
+          </w:p>
+        </w:tc>
+        <w:tc>
+          <w:tcPr>
+            <w:tcW w:type="dxa" w:w="3120"/>
+            <w:shd w:val="clear" w:fill="F6F7F6"/>
+          </w:tcPr>
+          <w:p>
+            <w:r/>
+            <w:r>
+              <w:rPr>
+                <w:rFonts w:ascii="Calibri" w:hAnsi="Calibri"/>
+                <w:b w:val="0"/>
+                <w:i w:val="0"/>
+                <w:color w:val="1A2329"/>
+                <w:sz w:val="20"/>
+              </w:rPr>
+              <w:t>Consultar el panel de una obra sin línea base guardada</w:t>
+            </w:r>
+          </w:p>
+        </w:tc>
+        <w:tc>
+          <w:tcPr>
+            <w:tcW w:type="dxa" w:w="3120"/>
+            <w:shd w:val="clear" w:fill="F6F7F6"/>
+          </w:tcPr>
+          <w:p>
+            <w:r/>
+            <w:r>
+              <w:rPr>
+                <w:rFonts w:ascii="Calibri" w:hAnsi="Calibri"/>
+                <w:b w:val="0"/>
+                <w:i w:val="0"/>
+                <w:color w:val="1A2329"/>
+                <w:sz w:val="20"/>
+              </w:rPr>
+              <w:t>El bloque de línea base indica que no está disponible y por qué, en vez de mostrar un desvío de 0 días.</w:t>
+            </w:r>
+          </w:p>
+        </w:tc>
+      </w:tr>
+      <w:tr>
+        <w:tc>
+          <w:tcPr>
+            <w:tcW w:type="dxa" w:w="3120"/>
+          </w:tcPr>
+          <w:p>
+            <w:r/>
+            <w:r>
+              <w:rPr>
+                <w:rFonts w:ascii="Calibri" w:hAnsi="Calibri"/>
+                <w:b w:val="0"/>
+                <w:i w:val="0"/>
+                <w:color w:val="1A2329"/>
+                <w:sz w:val="20"/>
+              </w:rPr>
+              <w:t>SPI en cero sin avance</w:t>
+            </w:r>
+          </w:p>
+        </w:tc>
+        <w:tc>
+          <w:tcPr>
+            <w:tcW w:type="dxa" w:w="3120"/>
+          </w:tcPr>
+          <w:p>
+            <w:r/>
+            <w:r>
+              <w:rPr>
+                <w:rFonts w:ascii="Calibri" w:hAnsi="Calibri"/>
+                <w:b w:val="0"/>
+                <w:i w:val="0"/>
+                <w:color w:val="1A2329"/>
+                <w:sz w:val="20"/>
+              </w:rPr>
+              <w:t>Consultar el panel de una obra con una tarea sin ningún avance pero con plan ya arrancado</w:t>
+            </w:r>
+          </w:p>
+        </w:tc>
+        <w:tc>
+          <w:tcPr>
+            <w:tcW w:type="dxa" w:w="3120"/>
+          </w:tcPr>
+          <w:p>
+            <w:r/>
+            <w:r>
+              <w:rPr>
+                <w:rFonts w:ascii="Calibri" w:hAnsi="Calibri"/>
+                <w:b w:val="0"/>
+                <w:i w:val="0"/>
+                <w:color w:val="1A2329"/>
+                <w:sz w:val="20"/>
+              </w:rPr>
+              <w:t>El SPI se calcula en 0.0 (no como error) y la fecha de fin proyectada se oculta por no ser confiable, en vez de dividir por cero.</w:t>
+            </w:r>
+          </w:p>
+        </w:tc>
+      </w:tr>
+      <w:tr>
+        <w:tc>
+          <w:tcPr>
+            <w:tcW w:type="dxa" w:w="3120"/>
+            <w:shd w:val="clear" w:fill="F6F7F6"/>
+          </w:tcPr>
+          <w:p>
+            <w:r/>
+            <w:r>
+              <w:rPr>
+                <w:rFonts w:ascii="Calibri" w:hAnsi="Calibri"/>
+                <w:b w:val="0"/>
+                <w:i w:val="0"/>
+                <w:color w:val="1A2329"/>
+                <w:sz w:val="20"/>
+              </w:rPr>
+              <w:t>Curva de avance con tracking desalineado</w:t>
+            </w:r>
+          </w:p>
+        </w:tc>
+        <w:tc>
+          <w:tcPr>
+            <w:tcW w:type="dxa" w:w="3120"/>
+            <w:shd w:val="clear" w:fill="F6F7F6"/>
+          </w:tcPr>
+          <w:p>
+            <w:r/>
+            <w:r>
+              <w:rPr>
+                <w:rFonts w:ascii="Calibri" w:hAnsi="Calibri"/>
+                <w:b w:val="0"/>
+                <w:i w:val="0"/>
+                <w:color w:val="1A2329"/>
+                <w:sz w:val="20"/>
+              </w:rPr>
+              <w:t>Consultar la curva de una obra cuyo job diario arrancó a trackear en un día de la semana distinto al de inicio de la obra</w:t>
+            </w:r>
+          </w:p>
+        </w:tc>
+        <w:tc>
+          <w:tcPr>
+            <w:tcW w:type="dxa" w:w="3120"/>
+            <w:shd w:val="clear" w:fill="F6F7F6"/>
+          </w:tcPr>
+          <w:p>
+            <w:r/>
+            <w:r>
+              <w:rPr>
+                <w:rFonts w:ascii="Calibri" w:hAnsi="Calibri"/>
+                <w:b w:val="0"/>
+                <w:i w:val="0"/>
+                <w:color w:val="1A2329"/>
+                <w:sz w:val="20"/>
+              </w:rPr>
+              <w:t>Cada punto semanal del gráfico muestra el valor real más cercano dentro de una tolerancia de tres días, en vez de quedar vacío por no coincidir la fecha exacta.</w:t>
+            </w:r>
+          </w:p>
+        </w:tc>
+      </w:tr>
+      <w:tr>
+        <w:tc>
+          <w:tcPr>
+            <w:tcW w:type="dxa" w:w="3120"/>
+          </w:tcPr>
+          <w:p>
+            <w:r/>
+            <w:r>
+              <w:rPr>
+                <w:rFonts w:ascii="Calibri" w:hAnsi="Calibri"/>
+                <w:b w:val="0"/>
+                <w:i w:val="0"/>
+                <w:color w:val="1A2329"/>
+                <w:sz w:val="20"/>
+              </w:rPr>
+              <w:t>Análisis mensual por rol</w:t>
+            </w:r>
+          </w:p>
+        </w:tc>
+        <w:tc>
+          <w:tcPr>
+            <w:tcW w:type="dxa" w:w="3120"/>
+          </w:tcPr>
+          <w:p>
+            <w:r/>
+            <w:r>
+              <w:rPr>
+                <w:rFonts w:ascii="Calibri" w:hAnsi="Calibri"/>
+                <w:b w:val="0"/>
+                <w:i w:val="0"/>
+                <w:color w:val="1A2329"/>
+                <w:sz w:val="20"/>
+              </w:rPr>
+              <w:t>Consultar el acordeón de análisis del período con un usuario administrador y con uno colaborador</w:t>
+            </w:r>
+          </w:p>
+        </w:tc>
+        <w:tc>
+          <w:tcPr>
+            <w:tcW w:type="dxa" w:w="3120"/>
+          </w:tcPr>
+          <w:p>
+            <w:r/>
+            <w:r>
+              <w:rPr>
+                <w:rFonts w:ascii="Calibri" w:hAnsi="Calibri"/>
+                <w:b w:val="0"/>
+                <w:i w:val="0"/>
+                <w:color w:val="1A2329"/>
+                <w:sz w:val="20"/>
+              </w:rPr>
+              <w:t>El ranking de retraso por tarea se muestra a ambos; el ranking por responsable solo llega en la respuesta del administrador.</w:t>
+            </w:r>
+          </w:p>
+        </w:tc>
+      </w:tr>
     </w:tbl>
     <w:p>
       <w:pPr>
@@ -16764,7 +17559,7 @@
           <w:color w:val="3E4A52"/>
           <w:sz w:val="21"/>
         </w:rPr>
-        <w:t xml:space="preserve"> El backend cuenta con 559 tests automatizados (</w:t>
+        <w:t xml:space="preserve"> El backend cuenta con 603 tests automatizados (</w:t>
       </w:r>
       <w:r>
         <w:rPr>
@@ -16784,7 +17579,7 @@
           <w:color w:val="3E4A52"/>
           <w:sz w:val="21"/>
         </w:rPr>
-        <w:t>, 49 archivos) y el frontend con 49 (</w:t>
+        <w:t>, 54 archivos) y el frontend con 49 (</w:t>
       </w:r>
       <w:r>
         <w:rPr>
@@ -16944,6 +17739,33 @@
           <w:sz w:val="22"/>
         </w:rPr>
         <w:t xml:space="preserve"> las alertas automáticas y la ruta crítica permiten anticipar el impacto de una demora antes de que afecte a tareas posteriores.</w:t>
+      </w:r>
+    </w:p>
+    <w:p>
+      <w:pPr>
+        <w:pStyle w:val="ListBullet"/>
+        <w:spacing w:after="60"/>
+        <w:jc w:val="both"/>
+      </w:pPr>
+      <w:r>
+        <w:rPr>
+          <w:rFonts w:ascii="Calibri" w:hAnsi="Calibri"/>
+          <w:b/>
+          <w:i w:val="0"/>
+          <w:color w:val="1A2329"/>
+          <w:sz w:val="22"/>
+        </w:rPr>
+        <w:t>Lectura honesta del avance:</w:t>
+      </w:r>
+      <w:r>
+        <w:rPr>
+          <w:rFonts w:ascii="Calibri" w:hAnsi="Calibri"/>
+          <w:b w:val="0"/>
+          <w:i w:val="0"/>
+          <w:color w:val="1A2329"/>
+          <w:sz w:val="22"/>
+        </w:rPr>
+        <w:t xml:space="preserve"> el panel de obra reemplaza el conteo simple de tareas completadas por un avance ponderado por duración, un índice de desempeño del cronograma (SPI) y una fecha de fin proyectada, de modo que una obra con tareas grandes sin terminar ya no aparece más avanzada de lo que está.</w:t>
       </w:r>
     </w:p>
     <w:p>

</xml_diff>

<commit_message>
docs: bitácora y actualización del IPI de la limpieza de ESLint
Refleja la limpieza integral de los 70 problemas preexistentes de ESLint
(PR #125): entrada de bitácora con el detalle por grupo de reglas y el
bug real encontrado en GanttTimeline, y RNF-06 del IPI actualizado.

Co-Authored-By: Claude Sonnet 5 <noreply@anthropic.com>
</commit_message>
<xml_diff>
--- a/docs/ipi/IPI-CONSTRUCTA.docx
+++ b/docs/ipi/IPI-CONSTRUCTA.docx
@@ -11069,7 +11069,67 @@
           <w:color w:val="1A2329"/>
           <w:sz w:val="22"/>
         </w:rPr>
-        <w:t xml:space="preserve"> separación en capas (router → service → repository), esquema de base de datos versionado con migraciones (Alembic) y tipado estático en backend (Python con anotaciones de tipo) y frontend (TypeScript).</w:t>
+        <w:t xml:space="preserve"> separación en capas (router → service → repository), esquema de base de datos versionado con migraciones (Alembic) y tipado estático en backend (Python con anotaciones de tipo) y frontend (TypeScript). El linter del frontend (ESLint, con las reglas de React 19 y de </w:t>
+      </w:r>
+      <w:r>
+        <w:rPr>
+          <w:rFonts w:ascii="Calibri" w:hAnsi="Calibri"/>
+          <w:b w:val="0"/>
+          <w:i/>
+          <w:color w:val="1A2329"/>
+          <w:sz w:val="22"/>
+        </w:rPr>
+        <w:t>Fast Refresh</w:t>
+      </w:r>
+      <w:r>
+        <w:rPr>
+          <w:rFonts w:ascii="Calibri" w:hAnsi="Calibri"/>
+          <w:b w:val="0"/>
+          <w:i w:val="0"/>
+          <w:color w:val="1A2329"/>
+          <w:sz w:val="22"/>
+        </w:rPr>
+        <w:t xml:space="preserve"> de Vite) corre limpio de forma sostenida: el 10/09/2026 se resolvieron los 70 problemas preexistentes detectados en una revisión integral (no limitada a los módulos en desarrollo), separando en archivos propios los </w:t>
+      </w:r>
+      <w:r>
+        <w:rPr>
+          <w:rFonts w:ascii="Calibri" w:hAnsi="Calibri"/>
+          <w:b w:val="0"/>
+          <w:i/>
+          <w:color w:val="1A2329"/>
+          <w:sz w:val="22"/>
+        </w:rPr>
+        <w:t>hooks</w:t>
+      </w:r>
+      <w:r>
+        <w:rPr>
+          <w:rFonts w:ascii="Calibri" w:hAnsi="Calibri"/>
+          <w:b w:val="0"/>
+          <w:i w:val="0"/>
+          <w:color w:val="1A2329"/>
+          <w:sz w:val="22"/>
+        </w:rPr>
+        <w:t xml:space="preserve"> y objetos de contexto que antes compartían archivo con un componente, y corrigiendo un desvío real de datos detectado al aplicar el fix (</w:t>
+      </w:r>
+      <w:r>
+        <w:rPr>
+          <w:rFonts w:ascii="Consolas" w:hAnsi="Consolas"/>
+          <w:b w:val="0"/>
+          <w:i w:val="0"/>
+          <w:color w:val="1A2329"/>
+          <w:sz w:val="21"/>
+        </w:rPr>
+        <w:t>GanttTimeline.tsx</w:t>
+      </w:r>
+      <w:r>
+        <w:rPr>
+          <w:rFonts w:ascii="Calibri" w:hAnsi="Calibri"/>
+          <w:b w:val="0"/>
+          <w:i w:val="0"/>
+          <w:color w:val="1A2329"/>
+          <w:sz w:val="22"/>
+        </w:rPr>
+        <w:t>: una referencia leída durante el renderizado del arrastre de filas del cronograma podía quedar desactualizada).</w:t>
       </w:r>
     </w:p>
     <w:p>

</xml_diff>

<commit_message>
feat(dashboard): visualización de desvíos y problemas (I-14 a I-16)
Expone en el acordeón mensual del dashboard tres métricas que
obra_stats_service.py ya calculaba pero solo alimentaban el informe
interno con IA: evidencia de las tareas con mayor desvío (bitácora,
alertas y cascada, sin identificar al responsable), temas recurrentes
de bitácora con su correlación con retrasos, y velocidad de reacción
a alertas por tipo. Sin migración ni endpoint nuevo — mismo snapshot
mensual de GET /obras/{id}/dashboard/monthly-insights.

Diseño documentado en docs/features/dashboard-indicadores-obra.md
(sección 4-bis) antes de implementar, siguiendo el protocolo del
proyecto. Verificado manualmente en navegador contra datos reales de
desarrollo, sin errores de consola.

Co-Authored-By: Claude Sonnet 5 <noreply@anthropic.com>
</commit_message>
<xml_diff>
--- a/docs/ipi/IPI-CONSTRUCTA.docx
+++ b/docs/ipi/IPI-CONSTRUCTA.docx
@@ -3108,7 +3108,47 @@
                 <w:color w:val="1A2329"/>
                 <w:sz w:val="20"/>
               </w:rPr>
-              <w:t xml:space="preserve">Panel de obra con trece indicadores servidos en una sola llamada: avance real ponderado por duración, avance planificado, índice de desempeño del cronograma (SPI), fecha de fin proyectada, salud de la ruta crítica, desvío contra la línea base, estado de hitos, ejecución de materiales, alertas por severidad, cuello de botella, y una curva de evolución planificado/real historizada día a día por un job del planificador. Cada bloque declara si el dato está disponible y por qué no lo está, en vez de completar con ceros. Diseño documentado en </w:t>
+              <w:t>Panel de obra con dieciséis indicadores: avance real ponderado por duración, avance planificado, índice de desempeño del cronograma (SPI), fecha de fin proyectada, salud de la ruta crítica, desvío contra la línea base, estado de hitos, ejecución de materiales, alertas por severidad, cuello de botella y una curva de evolución planificado/real historizada día a día por un job del planificador, servidos en una sola llamada (</w:t>
+            </w:r>
+            <w:r>
+              <w:rPr>
+                <w:rFonts w:ascii="Consolas" w:hAnsi="Consolas"/>
+                <w:b w:val="0"/>
+                <w:i w:val="0"/>
+                <w:color w:val="1A2329"/>
+                <w:sz w:val="19"/>
+              </w:rPr>
+              <w:t>GET /obras/{id}/dashboard</w:t>
+            </w:r>
+            <w:r>
+              <w:rPr>
+                <w:rFonts w:ascii="Calibri" w:hAnsi="Calibri"/>
+                <w:b w:val="0"/>
+                <w:i w:val="0"/>
+                <w:color w:val="1A2329"/>
+                <w:sz w:val="20"/>
+              </w:rPr>
+              <w:t xml:space="preserve">); más un acordeón mensual con concentración de retrasos, precisión de estimación por disciplina, evidencia de las tareas con mayor desvío (bitácora, alertas e impacto en cascada, sin identificar al responsable), temas recurrentes de bitácora con su correlación con retrasos posteriores y velocidad de reacción a alertas por tipo, leídos de </w:t>
+            </w:r>
+            <w:r>
+              <w:rPr>
+                <w:rFonts w:ascii="Consolas" w:hAnsi="Consolas"/>
+                <w:b w:val="0"/>
+                <w:i w:val="0"/>
+                <w:color w:val="1A2329"/>
+                <w:sz w:val="19"/>
+              </w:rPr>
+              <w:t>GET /obras/{id}/dashboard/monthly-insights</w:t>
+            </w:r>
+            <w:r>
+              <w:rPr>
+                <w:rFonts w:ascii="Calibri" w:hAnsi="Calibri"/>
+                <w:b w:val="0"/>
+                <w:i w:val="0"/>
+                <w:color w:val="1A2329"/>
+                <w:sz w:val="20"/>
+              </w:rPr>
+              <w:t xml:space="preserve">. Cada bloque declara si el dato está disponible y por qué no lo está, en vez de completar con ceros. Diseño documentado en </w:t>
             </w:r>
             <w:r>
               <w:rPr>
@@ -3128,7 +3168,7 @@
                 <w:color w:val="1A2329"/>
                 <w:sz w:val="20"/>
               </w:rPr>
-              <w:t xml:space="preserve"> (09/09/2026) e implementación en tres etapas incrementales cerrada el 10/09/2026.</w:t>
+              <w:t xml:space="preserve"> (09/09/2026, extendido el 10/09/2026) e implementación en cuatro etapas incrementales, la última cerrada el 10/09/2026.</w:t>
             </w:r>
           </w:p>
         </w:tc>
@@ -10837,6 +10877,33 @@
     </w:p>
     <w:p>
       <w:pPr>
+        <w:pStyle w:val="ListBullet"/>
+        <w:spacing w:after="60"/>
+        <w:jc w:val="both"/>
+      </w:pPr>
+      <w:r>
+        <w:rPr>
+          <w:rFonts w:ascii="Calibri" w:hAnsi="Calibri"/>
+          <w:b/>
+          <w:i w:val="0"/>
+          <w:color w:val="1A2329"/>
+          <w:sz w:val="22"/>
+        </w:rPr>
+        <w:t>RF-83:</w:t>
+      </w:r>
+      <w:r>
+        <w:rPr>
+          <w:rFonts w:ascii="Calibri" w:hAnsi="Calibri"/>
+          <w:b w:val="0"/>
+          <w:i w:val="0"/>
+          <w:color w:val="1A2329"/>
+          <w:sz w:val="22"/>
+        </w:rPr>
+        <w:t xml:space="preserve"> El sistema debe exponer en el panel, para las tareas con mayor desvío del período, un paquete de evidencia (menciones de bitácora, alertas asociadas e impacto en cascada) sin identificar al responsable de la tarea; debe además agrupar las menciones de bitácora por tipo de problema recurrente con su correlación con retrasos posteriores, y mostrar la velocidad de reacción a alertas por tipo.</w:t>
+      </w:r>
+    </w:p>
+    <w:p>
+      <w:pPr>
         <w:keepNext/>
         <w:spacing w:before="200" w:after="80"/>
       </w:pPr>
@@ -15592,7 +15659,7 @@
           <w:color w:val="1A2329"/>
           <w:sz w:val="22"/>
         </w:rPr>
-        <w:t xml:space="preserve"> reemplaza el panel de obra original —que contaba tareas completadas sin ponderar su tamaño— por trece indicadores servidos en una sola llamada (</w:t>
+        <w:t xml:space="preserve"> reemplaza el panel de obra original —que contaba tareas completadas sin ponderar su tamaño— por dieciséis indicadores, diseñados primero como documento (</w:t>
       </w:r>
       <w:r>
         <w:rPr>
@@ -15602,6 +15669,26 @@
           <w:color w:val="1A2329"/>
           <w:sz w:val="21"/>
         </w:rPr>
+        <w:t>docs/features/dashboard-indicadores-obra.md</w:t>
+      </w:r>
+      <w:r>
+        <w:rPr>
+          <w:rFonts w:ascii="Calibri" w:hAnsi="Calibri"/>
+          <w:b w:val="0"/>
+          <w:i w:val="0"/>
+          <w:color w:val="1A2329"/>
+          <w:sz w:val="22"/>
+        </w:rPr>
+        <w:t>) y luego implementados en cuatro etapas incrementales. Los indicadores en vivo se sirven en una sola llamada (</w:t>
+      </w:r>
+      <w:r>
+        <w:rPr>
+          <w:rFonts w:ascii="Consolas" w:hAnsi="Consolas"/>
+          <w:b w:val="0"/>
+          <w:i w:val="0"/>
+          <w:color w:val="1A2329"/>
+          <w:sz w:val="21"/>
+        </w:rPr>
         <w:t>GET /obras/{id}/dashboard</w:t>
       </w:r>
       <w:r>
@@ -15612,7 +15699,187 @@
           <w:color w:val="1A2329"/>
           <w:sz w:val="22"/>
         </w:rPr>
-        <w:t>), diseñados primero como documento (</w:t>
+        <w:t xml:space="preserve">). El </w:t>
+      </w:r>
+      <w:r>
+        <w:rPr>
+          <w:rFonts w:ascii="Calibri" w:hAnsi="Calibri"/>
+          <w:b/>
+          <w:i w:val="0"/>
+          <w:color w:val="1A2329"/>
+          <w:sz w:val="22"/>
+        </w:rPr>
+        <w:t>avance real</w:t>
+      </w:r>
+      <w:r>
+        <w:rPr>
+          <w:rFonts w:ascii="Calibri" w:hAnsi="Calibri"/>
+          <w:b w:val="0"/>
+          <w:i w:val="0"/>
+          <w:color w:val="1A2329"/>
+          <w:sz w:val="22"/>
+        </w:rPr>
+        <w:t xml:space="preserve"> se pondera por la duración planificada de cada tarea en días laborables, y se compara contra el </w:t>
+      </w:r>
+      <w:r>
+        <w:rPr>
+          <w:rFonts w:ascii="Calibri" w:hAnsi="Calibri"/>
+          <w:b/>
+          <w:i w:val="0"/>
+          <w:color w:val="1A2329"/>
+          <w:sz w:val="22"/>
+        </w:rPr>
+        <w:t>avance planificado</w:t>
+      </w:r>
+      <w:r>
+        <w:rPr>
+          <w:rFonts w:ascii="Calibri" w:hAnsi="Calibri"/>
+          <w:b w:val="0"/>
+          <w:i w:val="0"/>
+          <w:color w:val="1A2329"/>
+          <w:sz w:val="22"/>
+        </w:rPr>
+        <w:t xml:space="preserve"> a la fecha para obtener el </w:t>
+      </w:r>
+      <w:r>
+        <w:rPr>
+          <w:rFonts w:ascii="Calibri" w:hAnsi="Calibri"/>
+          <w:b/>
+          <w:i w:val="0"/>
+          <w:color w:val="1A2329"/>
+          <w:sz w:val="22"/>
+        </w:rPr>
+        <w:t>índice de desempeño del cronograma (SPI)</w:t>
+      </w:r>
+      <w:r>
+        <w:rPr>
+          <w:rFonts w:ascii="Calibri" w:hAnsi="Calibri"/>
+          <w:b w:val="0"/>
+          <w:i w:val="0"/>
+          <w:color w:val="1A2329"/>
+          <w:sz w:val="22"/>
+        </w:rPr>
+        <w:t xml:space="preserve">, del que además se deriva una </w:t>
+      </w:r>
+      <w:r>
+        <w:rPr>
+          <w:rFonts w:ascii="Calibri" w:hAnsi="Calibri"/>
+          <w:b/>
+          <w:i w:val="0"/>
+          <w:color w:val="1A2329"/>
+          <w:sz w:val="22"/>
+        </w:rPr>
+        <w:t>fecha de fin proyectada</w:t>
+      </w:r>
+      <w:r>
+        <w:rPr>
+          <w:rFonts w:ascii="Calibri" w:hAnsi="Calibri"/>
+          <w:b w:val="0"/>
+          <w:i w:val="0"/>
+          <w:color w:val="1A2329"/>
+          <w:sz w:val="22"/>
+        </w:rPr>
+        <w:t xml:space="preserve">. Se agregan en el mismo panel la </w:t>
+      </w:r>
+      <w:r>
+        <w:rPr>
+          <w:rFonts w:ascii="Calibri" w:hAnsi="Calibri"/>
+          <w:b/>
+          <w:i w:val="0"/>
+          <w:color w:val="1A2329"/>
+          <w:sz w:val="22"/>
+        </w:rPr>
+        <w:t>salud de la ruta crítica</w:t>
+      </w:r>
+      <w:r>
+        <w:rPr>
+          <w:rFonts w:ascii="Calibri" w:hAnsi="Calibri"/>
+          <w:b w:val="0"/>
+          <w:i w:val="0"/>
+          <w:color w:val="1A2329"/>
+          <w:sz w:val="22"/>
+        </w:rPr>
+        <w:t xml:space="preserve"> (tareas críticas, en riesgo y holgura mediana, con su porcentaje de cobertura), el </w:t>
+      </w:r>
+      <w:r>
+        <w:rPr>
+          <w:rFonts w:ascii="Calibri" w:hAnsi="Calibri"/>
+          <w:b/>
+          <w:i w:val="0"/>
+          <w:color w:val="1A2329"/>
+          <w:sz w:val="22"/>
+        </w:rPr>
+        <w:t>desvío contra la línea base</w:t>
+      </w:r>
+      <w:r>
+        <w:rPr>
+          <w:rFonts w:ascii="Calibri" w:hAnsi="Calibri"/>
+          <w:b w:val="0"/>
+          <w:i w:val="0"/>
+          <w:color w:val="1A2329"/>
+          <w:sz w:val="22"/>
+        </w:rPr>
+        <w:t xml:space="preserve"> guardada, el </w:t>
+      </w:r>
+      <w:r>
+        <w:rPr>
+          <w:rFonts w:ascii="Calibri" w:hAnsi="Calibri"/>
+          <w:b/>
+          <w:i w:val="0"/>
+          <w:color w:val="1A2329"/>
+          <w:sz w:val="22"/>
+        </w:rPr>
+        <w:t>estado de cada hito</w:t>
+      </w:r>
+      <w:r>
+        <w:rPr>
+          <w:rFonts w:ascii="Calibri" w:hAnsi="Calibri"/>
+          <w:b w:val="0"/>
+          <w:i w:val="0"/>
+          <w:color w:val="1A2329"/>
+          <w:sz w:val="22"/>
+        </w:rPr>
+        <w:t xml:space="preserve"> (cumplido, cumplido con demora, en riesgo o pendiente) y la </w:t>
+      </w:r>
+      <w:r>
+        <w:rPr>
+          <w:rFonts w:ascii="Calibri" w:hAnsi="Calibri"/>
+          <w:b/>
+          <w:i w:val="0"/>
+          <w:color w:val="1A2329"/>
+          <w:sz w:val="22"/>
+        </w:rPr>
+        <w:t>ejecución de materiales</w:t>
+      </w:r>
+      <w:r>
+        <w:rPr>
+          <w:rFonts w:ascii="Calibri" w:hAnsi="Calibri"/>
+          <w:b w:val="0"/>
+          <w:i w:val="0"/>
+          <w:color w:val="1A2329"/>
+          <w:sz w:val="22"/>
+        </w:rPr>
+        <w:t xml:space="preserve"> frente al estimado, con un indicador de alineación entre lo recibido y el avance real. Cada bloque declara explícitamente si el dato está disponible y por qué no, en vez de mostrar un cero cuando no hay información suficiente —por ejemplo, sin línea base guardada el bloque correspondiente no se calcula, no se completa con ceros—. Para la </w:t>
+      </w:r>
+      <w:r>
+        <w:rPr>
+          <w:rFonts w:ascii="Calibri" w:hAnsi="Calibri"/>
+          <w:b/>
+          <w:i w:val="0"/>
+          <w:color w:val="1A2329"/>
+          <w:sz w:val="22"/>
+        </w:rPr>
+        <w:t>evolución histórica</w:t>
+      </w:r>
+      <w:r>
+        <w:rPr>
+          <w:rFonts w:ascii="Calibri" w:hAnsi="Calibri"/>
+          <w:b w:val="0"/>
+          <w:i w:val="0"/>
+          <w:color w:val="1A2329"/>
+          <w:sz w:val="22"/>
+        </w:rPr>
+        <w:t xml:space="preserve"> (curva de avance planificado vs. real en el tiempo) se agregó una tabla nueva (</w:t>
       </w:r>
       <w:r>
         <w:rPr>
@@ -15622,17 +15889,73 @@
           <w:color w:val="1A2329"/>
           <w:sz w:val="21"/>
         </w:rPr>
-        <w:t>docs/features/dashboard-indicadores-obra.md</w:t>
-      </w:r>
-      <w:r>
-        <w:rPr>
-          <w:rFonts w:ascii="Calibri" w:hAnsi="Calibri"/>
-          <w:b w:val="0"/>
-          <w:i w:val="0"/>
-          <w:color w:val="1A2329"/>
-          <w:sz w:val="22"/>
-        </w:rPr>
-        <w:t xml:space="preserve">) y luego implementados en tres etapas incrementales. El </w:t>
+        <w:t>obra_progress_daily</w:t>
+      </w:r>
+      <w:r>
+        <w:rPr>
+          <w:rFonts w:ascii="Calibri" w:hAnsi="Calibri"/>
+          <w:b w:val="0"/>
+          <w:i w:val="0"/>
+          <w:color w:val="1A2329"/>
+          <w:sz w:val="22"/>
+        </w:rPr>
+        <w:t>) que un job diario del planificador completa hacia adelante, sin reconstruir el pasado desde el historial de eventos por ser una operación frágil; el ajuste no fue trivial, porque el punto semanal del gráfico y la fila guardada por el job rara vez caen en la misma fecha exacta —se emparejan por cercanía, con una tolerancia de tres días—.</w:t>
+      </w:r>
+    </w:p>
+    <w:p>
+      <w:pPr>
+        <w:spacing w:after="160" w:lineRule="auto" w:line="276"/>
+        <w:jc w:val="both"/>
+      </w:pPr>
+      <w:r>
+        <w:rPr>
+          <w:rFonts w:ascii="Calibri" w:hAnsi="Calibri"/>
+          <w:b w:val="0"/>
+          <w:i w:val="0"/>
+          <w:color w:val="1A2329"/>
+          <w:sz w:val="22"/>
+        </w:rPr>
+        <w:t>Un acordeón colapsado por defecto (</w:t>
+      </w:r>
+      <w:r>
+        <w:rPr>
+          <w:rFonts w:ascii="Consolas" w:hAnsi="Consolas"/>
+          <w:b w:val="0"/>
+          <w:i w:val="0"/>
+          <w:color w:val="1A2329"/>
+          <w:sz w:val="21"/>
+        </w:rPr>
+        <w:t>GET /obras/{id}/dashboard/monthly-insights</w:t>
+      </w:r>
+      <w:r>
+        <w:rPr>
+          <w:rFonts w:ascii="Calibri" w:hAnsi="Calibri"/>
+          <w:b w:val="0"/>
+          <w:i w:val="0"/>
+          <w:color w:val="1A2329"/>
+          <w:sz w:val="22"/>
+        </w:rPr>
+        <w:t>) expone cinco métricas que el motor de estadísticas mensual (</w:t>
+      </w:r>
+      <w:r>
+        <w:rPr>
+          <w:rFonts w:ascii="Consolas" w:hAnsi="Consolas"/>
+          <w:b w:val="0"/>
+          <w:i w:val="0"/>
+          <w:color w:val="1A2329"/>
+          <w:sz w:val="21"/>
+        </w:rPr>
+        <w:t>ObraStatsService</w:t>
+      </w:r>
+      <w:r>
+        <w:rPr>
+          <w:rFonts w:ascii="Calibri" w:hAnsi="Calibri"/>
+          <w:b w:val="0"/>
+          <w:i w:val="0"/>
+          <w:color w:val="1A2329"/>
+          <w:sz w:val="22"/>
+        </w:rPr>
+        <w:t xml:space="preserve">) ya calculaba para alimentar el informe interno con IA, pero que hasta el 10/09/2026 nunca habían llegado a una pantalla: la </w:t>
       </w:r>
       <w:r>
         <w:rPr>
@@ -15642,17 +15965,17 @@
           <w:color w:val="1A2329"/>
           <w:sz w:val="22"/>
         </w:rPr>
-        <w:t>avance real</w:t>
-      </w:r>
-      <w:r>
-        <w:rPr>
-          <w:rFonts w:ascii="Calibri" w:hAnsi="Calibri"/>
-          <w:b w:val="0"/>
-          <w:i w:val="0"/>
-          <w:color w:val="1A2329"/>
-          <w:sz w:val="22"/>
-        </w:rPr>
-        <w:t xml:space="preserve"> se pondera por la duración planificada de cada tarea en días laborables, y se compara contra el </w:t>
+        <w:t>concentración de retrasos</w:t>
+      </w:r>
+      <w:r>
+        <w:rPr>
+          <w:rFonts w:ascii="Calibri" w:hAnsi="Calibri"/>
+          <w:b w:val="0"/>
+          <w:i w:val="0"/>
+          <w:color w:val="1A2329"/>
+          <w:sz w:val="22"/>
+        </w:rPr>
+        <w:t xml:space="preserve"> (regla 80/20, por tarea y por responsable; el detalle por responsable se filtra en el backend y solo se envía a usuarios administradores, para no convertir una herramienta de coordinación en una de evaluación de desempeño individual), la </w:t>
       </w:r>
       <w:r>
         <w:rPr>
@@ -15662,17 +15985,17 @@
           <w:color w:val="1A2329"/>
           <w:sz w:val="22"/>
         </w:rPr>
-        <w:t>avance planificado</w:t>
-      </w:r>
-      <w:r>
-        <w:rPr>
-          <w:rFonts w:ascii="Calibri" w:hAnsi="Calibri"/>
-          <w:b w:val="0"/>
-          <w:i w:val="0"/>
-          <w:color w:val="1A2329"/>
-          <w:sz w:val="22"/>
-        </w:rPr>
-        <w:t xml:space="preserve"> a la fecha para obtener el </w:t>
+        <w:t>precisión histórica de estimación</w:t>
+      </w:r>
+      <w:r>
+        <w:rPr>
+          <w:rFonts w:ascii="Calibri" w:hAnsi="Calibri"/>
+          <w:b w:val="0"/>
+          <w:i w:val="0"/>
+          <w:color w:val="1A2329"/>
+          <w:sz w:val="22"/>
+        </w:rPr>
+        <w:t xml:space="preserve"> por disciplina, la </w:t>
       </w:r>
       <w:r>
         <w:rPr>
@@ -15682,17 +16005,17 @@
           <w:color w:val="1A2329"/>
           <w:sz w:val="22"/>
         </w:rPr>
-        <w:t>índice de desempeño del cronograma (SPI)</w:t>
-      </w:r>
-      <w:r>
-        <w:rPr>
-          <w:rFonts w:ascii="Calibri" w:hAnsi="Calibri"/>
-          <w:b w:val="0"/>
-          <w:i w:val="0"/>
-          <w:color w:val="1A2329"/>
-          <w:sz w:val="22"/>
-        </w:rPr>
-        <w:t xml:space="preserve">, del que además se deriva una </w:t>
+        <w:t>evidencia de las tareas con mayor desvío</w:t>
+      </w:r>
+      <w:r>
+        <w:rPr>
+          <w:rFonts w:ascii="Calibri" w:hAnsi="Calibri"/>
+          <w:b w:val="0"/>
+          <w:i w:val="0"/>
+          <w:color w:val="1A2329"/>
+          <w:sz w:val="22"/>
+        </w:rPr>
+        <w:t xml:space="preserve"> (menciones de bitácora, alertas asociadas e impacto en cascada sobre tareas dependientes), los </w:t>
       </w:r>
       <w:r>
         <w:rPr>
@@ -15702,17 +16025,17 @@
           <w:color w:val="1A2329"/>
           <w:sz w:val="22"/>
         </w:rPr>
-        <w:t>fecha de fin proyectada</w:t>
-      </w:r>
-      <w:r>
-        <w:rPr>
-          <w:rFonts w:ascii="Calibri" w:hAnsi="Calibri"/>
-          <w:b w:val="0"/>
-          <w:i w:val="0"/>
-          <w:color w:val="1A2329"/>
-          <w:sz w:val="22"/>
-        </w:rPr>
-        <w:t xml:space="preserve">. Se agregan en el mismo panel la </w:t>
+        <w:t>temas recurrentes de bitácora</w:t>
+      </w:r>
+      <w:r>
+        <w:rPr>
+          <w:rFonts w:ascii="Calibri" w:hAnsi="Calibri"/>
+          <w:b w:val="0"/>
+          <w:i w:val="0"/>
+          <w:color w:val="1A2329"/>
+          <w:sz w:val="22"/>
+        </w:rPr>
+        <w:t xml:space="preserve"> (falta de material, clima, ausencia de personal, proveedor, problema técnico, equipos y seguridad) con su correlación temporal con retrasos posteriores, y la </w:t>
       </w:r>
       <w:r>
         <w:rPr>
@@ -15722,117 +16045,17 @@
           <w:color w:val="1A2329"/>
           <w:sz w:val="22"/>
         </w:rPr>
-        <w:t>salud de la ruta crítica</w:t>
-      </w:r>
-      <w:r>
-        <w:rPr>
-          <w:rFonts w:ascii="Calibri" w:hAnsi="Calibri"/>
-          <w:b w:val="0"/>
-          <w:i w:val="0"/>
-          <w:color w:val="1A2329"/>
-          <w:sz w:val="22"/>
-        </w:rPr>
-        <w:t xml:space="preserve"> (tareas críticas, en riesgo y holgura mediana, con su porcentaje de cobertura), el </w:t>
-      </w:r>
-      <w:r>
-        <w:rPr>
-          <w:rFonts w:ascii="Calibri" w:hAnsi="Calibri"/>
-          <w:b/>
-          <w:i w:val="0"/>
-          <w:color w:val="1A2329"/>
-          <w:sz w:val="22"/>
-        </w:rPr>
-        <w:t>desvío contra la línea base</w:t>
-      </w:r>
-      <w:r>
-        <w:rPr>
-          <w:rFonts w:ascii="Calibri" w:hAnsi="Calibri"/>
-          <w:b w:val="0"/>
-          <w:i w:val="0"/>
-          <w:color w:val="1A2329"/>
-          <w:sz w:val="22"/>
-        </w:rPr>
-        <w:t xml:space="preserve"> guardada, el </w:t>
-      </w:r>
-      <w:r>
-        <w:rPr>
-          <w:rFonts w:ascii="Calibri" w:hAnsi="Calibri"/>
-          <w:b/>
-          <w:i w:val="0"/>
-          <w:color w:val="1A2329"/>
-          <w:sz w:val="22"/>
-        </w:rPr>
-        <w:t>estado de cada hito</w:t>
-      </w:r>
-      <w:r>
-        <w:rPr>
-          <w:rFonts w:ascii="Calibri" w:hAnsi="Calibri"/>
-          <w:b w:val="0"/>
-          <w:i w:val="0"/>
-          <w:color w:val="1A2329"/>
-          <w:sz w:val="22"/>
-        </w:rPr>
-        <w:t xml:space="preserve"> (cumplido, cumplido con demora, en riesgo o pendiente) y la </w:t>
-      </w:r>
-      <w:r>
-        <w:rPr>
-          <w:rFonts w:ascii="Calibri" w:hAnsi="Calibri"/>
-          <w:b/>
-          <w:i w:val="0"/>
-          <w:color w:val="1A2329"/>
-          <w:sz w:val="22"/>
-        </w:rPr>
-        <w:t>ejecución de materiales</w:t>
-      </w:r>
-      <w:r>
-        <w:rPr>
-          <w:rFonts w:ascii="Calibri" w:hAnsi="Calibri"/>
-          <w:b w:val="0"/>
-          <w:i w:val="0"/>
-          <w:color w:val="1A2329"/>
-          <w:sz w:val="22"/>
-        </w:rPr>
-        <w:t xml:space="preserve"> frente al estimado, con un indicador de alineación entre lo recibido y el avance real. Cada bloque declara explícitamente si el dato está disponible y por qué no, en vez de mostrar un cero cuando no hay información suficiente —por ejemplo, sin línea base guardada el bloque correspondiente no se calcula, no se completa con ceros—. Para la </w:t>
-      </w:r>
-      <w:r>
-        <w:rPr>
-          <w:rFonts w:ascii="Calibri" w:hAnsi="Calibri"/>
-          <w:b/>
-          <w:i w:val="0"/>
-          <w:color w:val="1A2329"/>
-          <w:sz w:val="22"/>
-        </w:rPr>
-        <w:t>evolución histórica</w:t>
-      </w:r>
-      <w:r>
-        <w:rPr>
-          <w:rFonts w:ascii="Calibri" w:hAnsi="Calibri"/>
-          <w:b w:val="0"/>
-          <w:i w:val="0"/>
-          <w:color w:val="1A2329"/>
-          <w:sz w:val="22"/>
-        </w:rPr>
-        <w:t xml:space="preserve"> (curva de avance planificado vs. real en el tiempo) se agregó una tabla nueva (</w:t>
-      </w:r>
-      <w:r>
-        <w:rPr>
-          <w:rFonts w:ascii="Consolas" w:hAnsi="Consolas"/>
-          <w:b w:val="0"/>
-          <w:i w:val="0"/>
-          <w:color w:val="1A2329"/>
-          <w:sz w:val="21"/>
-        </w:rPr>
-        <w:t>obra_progress_daily</w:t>
-      </w:r>
-      <w:r>
-        <w:rPr>
-          <w:rFonts w:ascii="Calibri" w:hAnsi="Calibri"/>
-          <w:b w:val="0"/>
-          <w:i w:val="0"/>
-          <w:color w:val="1A2329"/>
-          <w:sz w:val="22"/>
-        </w:rPr>
-        <w:t>) que un job diario del planificador completa hacia adelante, sin reconstruir el pasado desde el historial de eventos por ser una operación frágil; el ajuste no fue trivial, porque el punto semanal del gráfico y la fila guardada por el job rara vez caen en la misma fecha exacta —se emparejan por cercanía, con una tolerancia de tres días—. Por último, un acordeón colapsado por defecto expone dos métricas que el sistema ya calculaba mensualmente pero que hasta ahora solo alimentaban un informe interno sin consumo desde la aplicación: la concentración de retrasos (regla 80/20, por tarea y por responsable) y la precisión histórica de estimación por disciplina; el detalle por responsable se filtra en el backend y solo se envía a usuarios administradores, para no convertir una herramienta de coordinación en una de evaluación de desempeño individual.</w:t>
+        <w:t>velocidad de reacción a alertas</w:t>
+      </w:r>
+      <w:r>
+        <w:rPr>
+          <w:rFonts w:ascii="Calibri" w:hAnsi="Calibri"/>
+          <w:b w:val="0"/>
+          <w:i w:val="0"/>
+          <w:color w:val="1A2329"/>
+          <w:sz w:val="22"/>
+        </w:rPr>
+        <w:t xml:space="preserve"> por tipo. A diferencia de la concentración por responsable, estas tres últimas no traen ranking por persona y viajan igual para todos los roles; la de evidencia de desvíos sí omite deliberadamente el responsable de la tarea en lo que se muestra en pantalla —mismo criterio que la concentración por responsable, pero resuelto en el propio recorte de datos en vez de un filtro por rol—, porque es evidencia sobre una tarea y no un señalamiento de quién la causó. Para evitar que una correlación estadísticamente vacía se lea como un patrón, el porcentaje de correlación de un tema de bitácora solo se muestra a partir de tres menciones; por debajo, se muestra el conteo crudo.</w:t>
       </w:r>
     </w:p>
     <w:p>
@@ -16298,7 +16521,7 @@
           <w:color w:val="1A2329"/>
           <w:sz w:val="22"/>
         </w:rPr>
-        <w:t xml:space="preserve">). A esa suite se sumaron 49 pruebas de frontend con </w:t>
+        <w:t xml:space="preserve"> — este último extendido el 10/09/2026 para cubrir la evidencia de desvíos, los temas de bitácora y la reacción a alertas del acordeón mensual, sin sumar archivos nuevos). A esa suite se sumaron 49 pruebas de frontend con </w:t>
       </w:r>
       <w:r>
         <w:rPr>
@@ -17545,6 +17768,121 @@
                 <w:color w:val="1A2329"/>
                 <w:sz w:val="20"/>
               </w:rPr>
+              <w:t>Evidencia de desvíos por rol</w:t>
+            </w:r>
+          </w:p>
+        </w:tc>
+        <w:tc>
+          <w:tcPr>
+            <w:tcW w:type="dxa" w:w="3120"/>
+          </w:tcPr>
+          <w:p>
+            <w:r/>
+            <w:r>
+              <w:rPr>
+                <w:rFonts w:ascii="Calibri" w:hAnsi="Calibri"/>
+                <w:b w:val="0"/>
+                <w:i w:val="0"/>
+                <w:color w:val="1A2329"/>
+                <w:sz w:val="20"/>
+              </w:rPr>
+              <w:t>Consultar el acordeón mensual con un usuario administrador y con uno colaborador</w:t>
+            </w:r>
+          </w:p>
+        </w:tc>
+        <w:tc>
+          <w:tcPr>
+            <w:tcW w:type="dxa" w:w="3120"/>
+          </w:tcPr>
+          <w:p>
+            <w:r/>
+            <w:r>
+              <w:rPr>
+                <w:rFonts w:ascii="Calibri" w:hAnsi="Calibri"/>
+                <w:b w:val="0"/>
+                <w:i w:val="0"/>
+                <w:color w:val="1A2329"/>
+                <w:sz w:val="20"/>
+              </w:rPr>
+              <w:t>La evidencia de desvíos, los temas de bitácora y la reacción a alertas viajan igual para ambos roles; solo el ranking de concentración por responsable se omite para el colaborador.</w:t>
+            </w:r>
+          </w:p>
+        </w:tc>
+      </w:tr>
+      <w:tr>
+        <w:tc>
+          <w:tcPr>
+            <w:tcW w:type="dxa" w:w="3120"/>
+            <w:shd w:val="clear" w:fill="F6F7F6"/>
+          </w:tcPr>
+          <w:p>
+            <w:r/>
+            <w:r>
+              <w:rPr>
+                <w:rFonts w:ascii="Calibri" w:hAnsi="Calibri"/>
+                <w:b w:val="0"/>
+                <w:i w:val="0"/>
+                <w:color w:val="1A2329"/>
+                <w:sz w:val="20"/>
+              </w:rPr>
+              <w:t>Tema de bitácora con muestra chica</w:t>
+            </w:r>
+          </w:p>
+        </w:tc>
+        <w:tc>
+          <w:tcPr>
+            <w:tcW w:type="dxa" w:w="3120"/>
+            <w:shd w:val="clear" w:fill="F6F7F6"/>
+          </w:tcPr>
+          <w:p>
+            <w:r/>
+            <w:r>
+              <w:rPr>
+                <w:rFonts w:ascii="Calibri" w:hAnsi="Calibri"/>
+                <w:b w:val="0"/>
+                <w:i w:val="0"/>
+                <w:color w:val="1A2329"/>
+                <w:sz w:val="20"/>
+              </w:rPr>
+              <w:t>Una categoría de bitácora con una sola mención seguida de un retraso</w:t>
+            </w:r>
+          </w:p>
+        </w:tc>
+        <w:tc>
+          <w:tcPr>
+            <w:tcW w:type="dxa" w:w="3120"/>
+            <w:shd w:val="clear" w:fill="F6F7F6"/>
+          </w:tcPr>
+          <w:p>
+            <w:r/>
+            <w:r>
+              <w:rPr>
+                <w:rFonts w:ascii="Calibri" w:hAnsi="Calibri"/>
+                <w:b w:val="0"/>
+                <w:i w:val="0"/>
+                <w:color w:val="1A2329"/>
+                <w:sz w:val="20"/>
+              </w:rPr>
+              <w:t>El panel muestra el conteo crudo ("1 mención, 1 con retraso después") en vez de un porcentaje de correlación del 100%.</w:t>
+            </w:r>
+          </w:p>
+        </w:tc>
+      </w:tr>
+      <w:tr>
+        <w:tc>
+          <w:tcPr>
+            <w:tcW w:type="dxa" w:w="3120"/>
+          </w:tcPr>
+          <w:p>
+            <w:r/>
+            <w:r>
+              <w:rPr>
+                <w:rFonts w:ascii="Calibri" w:hAnsi="Calibri"/>
+                <w:b w:val="0"/>
+                <w:i w:val="0"/>
+                <w:color w:val="1A2329"/>
+                <w:sz w:val="20"/>
+              </w:rPr>
               <w:t>Análisis mensual por rol</w:t>
             </w:r>
           </w:p>

</xml_diff>

<commit_message>
feat(bitacora): la IA propone el % de avance en update_status (+ fix de reseteo a 0)
El audio dice 'la mampostería va al 75%' y ese dato se perdía: el esquema
de sugerencias no tenía dónde ponerlo. Migración 0075 agrega new_progress
a suggestions; la cadena completa: schema del análisis (solo porcentajes
explícitos del audio, nunca inventados) → fila → edición del jefe (0-100)
→ TaskStatusUpdate.estimated_progress → confirmación por WhatsApp y
tarjeta de sugerencia con el avance visible y editable.

Fix en el camino: TaskStatusUpdate.estimated_progress tiene default 0 y
el repo lo escribe siempre — aplicar una sugerencia de estado sin avance
propuesto reseteaba a 0% una tarea que ya venía avanzada. Ahora conserva
el avance actual cuando la sugerencia no trae uno.

Backend 606 passed (3 tests nuevos), frontend 52, tsc/eslint limpios.

Co-Authored-By: Claude Fable 5 <noreply@anthropic.com>
</commit_message>
<xml_diff>
--- a/docs/ipi/IPI-CONSTRUCTA.docx
+++ b/docs/ipi/IPI-CONSTRUCTA.docx
@@ -15044,7 +15044,27 @@
           <w:color w:val="1A2329"/>
           <w:sz w:val="22"/>
         </w:rPr>
-        <w:t xml:space="preserve"> sobre el plan —reprogramar una tarea, crear una tarea, cambiar un estado o dejar una nota—, cada una con una cita del audio que la justifica. Si el audio no contiene nada accionable, no se fuerzan sugerencias. El modelo recibe el </w:t>
+        <w:t xml:space="preserve"> sobre el plan —reprogramar una tarea, crear una tarea, cambiar un estado (con el </w:t>
+      </w:r>
+      <w:r>
+        <w:rPr>
+          <w:rFonts w:ascii="Calibri" w:hAnsi="Calibri"/>
+          <w:b/>
+          <w:i w:val="0"/>
+          <w:color w:val="1A2329"/>
+          <w:sz w:val="22"/>
+        </w:rPr>
+        <w:t>porcentaje de avance</w:t>
+      </w:r>
+      <w:r>
+        <w:rPr>
+          <w:rFonts w:ascii="Calibri" w:hAnsi="Calibri"/>
+          <w:b w:val="0"/>
+          <w:i w:val="0"/>
+          <w:color w:val="1A2329"/>
+          <w:sz w:val="22"/>
+        </w:rPr>
+        <w:t xml:space="preserve"> si el audio lo menciona: «la mampostería va al 75%» se traslada al avance de la tarea, y nunca se inventa un porcentaje que el audio no dice) o dejar una nota—, cada una con una cita del audio que la justifica. Si el audio no contiene nada accionable, no se fuerzan sugerencias. El modelo recibe el </w:t>
       </w:r>
       <w:r>
         <w:rPr>

</xml_diff>